<commit_message>
Update Final Project paper
</commit_message>
<xml_diff>
--- a/docs/CS 630 Final Project.docx
+++ b/docs/CS 630 Final Project.docx
@@ -130,59 +130,46 @@
     </w:p>
     <w:p>
       <w:r>
-        <w:t>In th</w:t>
+        <w:t>There are 7 tables in this database, represented as 7 entities in the ER diagram.</w:t>
+      </w:r>
+      <w:r>
+        <w:t xml:space="preserve"> </w:t>
+      </w:r>
+      <w:r>
+        <w:t>A single category or brand can be associated with many products, while each product belongs to only one category and one brand.</w:t>
+      </w:r>
+      <w:r>
+        <w:t xml:space="preserve"> </w:t>
+      </w:r>
+      <w:r>
+        <w:t xml:space="preserve">Each product receives more than one review, but that review only links to the specific product. </w:t>
+      </w:r>
+      <w:r>
+        <w:t xml:space="preserve">One user can write many reviews and cast many review votes. </w:t>
+      </w:r>
+      <w:r>
+        <w:t xml:space="preserve">Each </w:t>
+      </w:r>
+      <w:r>
+        <w:t>review can include multiple images and have multiple review votes</w:t>
+      </w:r>
+      <w:r>
+        <w:t>, whereas o</w:t>
+      </w:r>
+      <w:r>
+        <w:t xml:space="preserve">ne review vote or one review image </w:t>
       </w:r>
       <w:r>
         <w:t>is</w:t>
       </w:r>
       <w:r>
-        <w:t xml:space="preserve"> database, one category or one brand can have many products</w:t>
-      </w:r>
-      <w:r>
-        <w:t xml:space="preserve">, but one product can only belong to one brand </w:t>
-      </w:r>
-      <w:r>
-        <w:t xml:space="preserve">and </w:t>
-      </w:r>
-      <w:r>
-        <w:t>one category.</w:t>
-      </w:r>
-      <w:r>
-        <w:t xml:space="preserve"> </w:t>
-      </w:r>
-      <w:r>
-        <w:t xml:space="preserve">Each product receives more than one review, but that review only links to the specific product. </w:t>
-      </w:r>
-      <w:r>
-        <w:t xml:space="preserve">One user can write many reviews and cast many review votes. </w:t>
-      </w:r>
-      <w:r>
-        <w:t xml:space="preserve">Each </w:t>
-      </w:r>
-      <w:r>
-        <w:t>review can include multiple images and have multiple review votes</w:t>
-      </w:r>
-      <w:r>
-        <w:t>, whereas o</w:t>
-      </w:r>
-      <w:r>
-        <w:t xml:space="preserve">ne review vote or one review image </w:t>
-      </w:r>
-      <w:r>
-        <w:t>is</w:t>
-      </w:r>
-      <w:r>
         <w:t xml:space="preserve"> linked to one specific review.</w:t>
       </w:r>
     </w:p>
+    <w:p/>
     <w:p>
       <w:r>
         <w:t>Data Modeling</w:t>
-      </w:r>
-    </w:p>
-    <w:p>
-      <w:r>
-        <w:t xml:space="preserve">I created 7 tables for my product review and rating platform. </w:t>
       </w:r>
     </w:p>
     <w:p>
@@ -861,12 +848,26 @@
     <w:p>
       <w:r>
         <w:lastRenderedPageBreak/>
-        <w:t xml:space="preserve">Design </w:t>
-      </w:r>
-    </w:p>
-    <w:p>
-      <w:r>
-        <w:t>All tables are normalized to 3NF.</w:t>
+        <w:t>Design</w:t>
+      </w:r>
+      <w:r>
+        <w:t xml:space="preserve"> </w:t>
+      </w:r>
+    </w:p>
+    <w:p>
+      <w:r>
+        <w:t>All tables in my database are normalized to Third Normal Form (3NF</w:t>
+      </w:r>
+      <w:proofErr w:type="gramStart"/>
+      <w:r>
+        <w:t>)</w:t>
+      </w:r>
+      <w:proofErr w:type="gramEnd"/>
+      <w:r>
+        <w:t xml:space="preserve"> so the data stays organized. I used normalization to make the database easier to manage.</w:t>
+      </w:r>
+      <w:r>
+        <w:t xml:space="preserve"> </w:t>
       </w:r>
     </w:p>
     <w:p>
@@ -874,20 +875,11 @@
         <w:pStyle w:val="ListParagraph"/>
         <w:numPr>
           <w:ilvl w:val="0"/>
-          <w:numId w:val="1"/>
+          <w:numId w:val="2"/>
         </w:numPr>
       </w:pPr>
       <w:r>
-        <w:t xml:space="preserve">First normal form: each cell in my tables has only a single value and there are no repeated groups. </w:t>
-      </w:r>
-      <w:r>
-        <w:t xml:space="preserve">Each column and row </w:t>
-      </w:r>
-      <w:r>
-        <w:t>is</w:t>
-      </w:r>
-      <w:r>
-        <w:t xml:space="preserve"> also unique.</w:t>
+        <w:t>In First Normal Form (1NF), each cell in the table contains only one value, and there are no repeating groups. Each row is unique, and each column contains one type of data only.</w:t>
       </w:r>
     </w:p>
     <w:p>
@@ -895,20 +887,11 @@
         <w:pStyle w:val="ListParagraph"/>
         <w:numPr>
           <w:ilvl w:val="0"/>
-          <w:numId w:val="1"/>
+          <w:numId w:val="2"/>
         </w:numPr>
       </w:pPr>
       <w:r>
-        <w:t xml:space="preserve">Second normal form: </w:t>
-      </w:r>
-      <w:r>
-        <w:t xml:space="preserve">for each table in my database, there is only one primary key. All other non-key attributes are dependent only on the </w:t>
-      </w:r>
-      <w:r>
-        <w:t xml:space="preserve">whole </w:t>
-      </w:r>
-      <w:r>
-        <w:t>key attribute. There are no partial dependencies.</w:t>
+        <w:t>In Second Normal Form (2NF), each table has a primary key, and all the non-key columns depend on the whole primary key. Because of this, there are no partial dependencies in the database.</w:t>
       </w:r>
     </w:p>
     <w:p>
@@ -916,16 +899,51 @@
         <w:pStyle w:val="ListParagraph"/>
         <w:numPr>
           <w:ilvl w:val="0"/>
-          <w:numId w:val="1"/>
+          <w:numId w:val="2"/>
         </w:numPr>
       </w:pPr>
       <w:r>
-        <w:t xml:space="preserve">Third normal form: </w:t>
-      </w:r>
-      <w:r>
-        <w:t>The non-key attributes in my tables depend only on the primary key in the table. There are no transitive dependencies.</w:t>
-      </w:r>
-    </w:p>
+        <w:t>In Third Normal Form (3NF), the non-key attributes depend only on the primary key and not on other non-key attributes. This means there are no transitive dependencies. Each table in my design focuses on one main type of information, and the relationships between tables are connected using primary keys and foreign keys.</w:t>
+      </w:r>
+    </w:p>
+    <w:p>
+      <w:r>
+        <w:t xml:space="preserve">Brands and categories tables are stored in separate tables instead of </w:t>
+      </w:r>
+      <w:r>
+        <w:t>being stacked</w:t>
+      </w:r>
+      <w:r>
+        <w:t xml:space="preserve"> directly into the products tabl</w:t>
+      </w:r>
+      <w:r>
+        <w:t>e</w:t>
+      </w:r>
+      <w:r>
+        <w:t xml:space="preserve">. I did this to avoid repeating the same brand name or category name for </w:t>
+      </w:r>
+      <w:r>
+        <w:t>different</w:t>
+      </w:r>
+      <w:r>
+        <w:t xml:space="preserve"> products. If multiple products belong to Apple or are in the same category, that information only needs to be stored once, which makes the design cleaner and easier to update.</w:t>
+      </w:r>
+    </w:p>
+    <w:p>
+      <w:r>
+        <w:t>I also kept review votes in a separate table from reviews because they represent a different kind of data. One review can receive many votes from different users, so putting vote information inside the review table would not make sense. Keeping it separate makes the structure more organized and matches how a real system would work.</w:t>
+      </w:r>
+    </w:p>
+    <w:p>
+      <w:r>
+        <w:t xml:space="preserve">I added unique constraints to make sure the data follows important rules. For example, usernames and emails should be unique so each user account is different. I also used unique constraints to make sure one user cannot review the same product more than once, and one user </w:t>
+      </w:r>
+      <w:r>
+        <w:lastRenderedPageBreak/>
+        <w:t>cannot vote on the same review multiple times. These constraints help keep the data accurate and make the database work more like a real product review platform such as Amazon.</w:t>
+      </w:r>
+    </w:p>
+    <w:p/>
     <w:p>
       <w:r>
         <w:t>Analysis</w:t>
@@ -1011,8 +1029,13 @@
     </w:p>
     <w:p>
       <w:r>
-        <w:lastRenderedPageBreak/>
-        <w:t xml:space="preserve">If we want to get all the reviews with correlated </w:t>
+        <w:t xml:space="preserve">If we want to get all the reviews with </w:t>
+      </w:r>
+      <w:r>
+        <w:t xml:space="preserve">their </w:t>
+      </w:r>
+      <w:r>
+        <w:t xml:space="preserve">correlated </w:t>
       </w:r>
       <w:r>
         <w:t>user and product, we can use inner join</w:t>
@@ -1035,6 +1058,7 @@
         <w:rPr>
           <w:noProof/>
         </w:rPr>
+        <w:lastRenderedPageBreak/>
         <w:drawing>
           <wp:inline distT="0" distB="0" distL="0" distR="0" wp14:anchorId="430A0415" wp14:editId="43137C47">
             <wp:extent cx="5841083" cy="3827282"/>
@@ -1082,7 +1106,13 @@
       </w:r>
       <w:proofErr w:type="spellEnd"/>
       <w:r>
-        <w:t xml:space="preserve"> table, we can connect the information and understand whether a review is helpful or not through the votes. </w:t>
+        <w:t xml:space="preserve"> table, we can connect the information and </w:t>
+      </w:r>
+      <w:r>
+        <w:t>learn</w:t>
+      </w:r>
+      <w:r>
+        <w:t xml:space="preserve"> whether a review is helpful or not through the votes. </w:t>
       </w:r>
       <w:r>
         <w:t>From the screenshot, the “Excellent phone” review is helpful to the users.</w:t>
@@ -1189,8 +1219,275 @@
         </w:drawing>
       </w:r>
     </w:p>
-    <w:p/>
-    <w:p/>
+    <w:p>
+      <w:r>
+        <w:lastRenderedPageBreak/>
+        <w:t xml:space="preserve">If we want to check how many reviews each user has written, we can use users table to left join reviews table and count the number of </w:t>
+      </w:r>
+      <w:proofErr w:type="spellStart"/>
+      <w:proofErr w:type="gramStart"/>
+      <w:r>
+        <w:t>review</w:t>
+      </w:r>
+      <w:proofErr w:type="gramEnd"/>
+      <w:r>
+        <w:t>_id</w:t>
+      </w:r>
+      <w:proofErr w:type="spellEnd"/>
+      <w:r>
+        <w:t xml:space="preserve">. By ordering the </w:t>
+      </w:r>
+      <w:proofErr w:type="spellStart"/>
+      <w:r>
+        <w:t>total_reviews</w:t>
+      </w:r>
+      <w:proofErr w:type="spellEnd"/>
+      <w:r>
+        <w:t>, we can check each user with its number of reviews in descending order.</w:t>
+      </w:r>
+      <w:r>
+        <w:t xml:space="preserve"> In the screenshot, we can see “bob02” has </w:t>
+      </w:r>
+      <w:proofErr w:type="gramStart"/>
+      <w:r>
+        <w:t>the most</w:t>
+      </w:r>
+      <w:proofErr w:type="gramEnd"/>
+      <w:r>
+        <w:t xml:space="preserve"> number of reviews.</w:t>
+      </w:r>
+    </w:p>
+    <w:p>
+      <w:r>
+        <w:rPr>
+          <w:noProof/>
+        </w:rPr>
+        <w:drawing>
+          <wp:inline distT="0" distB="0" distL="0" distR="0" wp14:anchorId="30E009D5" wp14:editId="1DE5FEFB">
+            <wp:extent cx="5689600" cy="4292600"/>
+            <wp:effectExtent l="0" t="0" r="0" b="0"/>
+            <wp:docPr id="1823116164" name="Picture 1"/>
+            <wp:cNvGraphicFramePr>
+              <a:graphicFrameLocks xmlns:a="http://schemas.openxmlformats.org/drawingml/2006/main" noChangeAspect="1"/>
+            </wp:cNvGraphicFramePr>
+            <a:graphic xmlns:a="http://schemas.openxmlformats.org/drawingml/2006/main">
+              <a:graphicData uri="http://schemas.openxmlformats.org/drawingml/2006/picture">
+                <pic:pic xmlns:pic="http://schemas.openxmlformats.org/drawingml/2006/picture">
+                  <pic:nvPicPr>
+                    <pic:cNvPr id="1823116164" name=""/>
+                    <pic:cNvPicPr/>
+                  </pic:nvPicPr>
+                  <pic:blipFill>
+                    <a:blip r:embed="rId17"/>
+                    <a:stretch>
+                      <a:fillRect/>
+                    </a:stretch>
+                  </pic:blipFill>
+                  <pic:spPr>
+                    <a:xfrm>
+                      <a:off x="0" y="0"/>
+                      <a:ext cx="5689600" cy="4292600"/>
+                    </a:xfrm>
+                    <a:prstGeom prst="rect">
+                      <a:avLst/>
+                    </a:prstGeom>
+                  </pic:spPr>
+                </pic:pic>
+              </a:graphicData>
+            </a:graphic>
+          </wp:inline>
+        </w:drawing>
+      </w:r>
+    </w:p>
+    <w:p>
+      <w:r>
+        <w:t>We can also check whether any products have not received any reviews</w:t>
+      </w:r>
+      <w:r>
+        <w:t xml:space="preserve"> by joining products table with reviews table</w:t>
+      </w:r>
+      <w:r>
+        <w:t xml:space="preserve">. Based on the screenshot, no rows </w:t>
+      </w:r>
+      <w:r>
+        <w:t>are</w:t>
+      </w:r>
+      <w:r>
+        <w:t xml:space="preserve"> returned, which means every product has at least one review.</w:t>
+      </w:r>
+    </w:p>
+    <w:p>
+      <w:r>
+        <w:rPr>
+          <w:noProof/>
+        </w:rPr>
+        <w:lastRenderedPageBreak/>
+        <w:drawing>
+          <wp:inline distT="0" distB="0" distL="0" distR="0" wp14:anchorId="33F46228" wp14:editId="4166694E">
+            <wp:extent cx="5727700" cy="4127500"/>
+            <wp:effectExtent l="0" t="0" r="0" b="0"/>
+            <wp:docPr id="350037781" name="Picture 1"/>
+            <wp:cNvGraphicFramePr>
+              <a:graphicFrameLocks xmlns:a="http://schemas.openxmlformats.org/drawingml/2006/main" noChangeAspect="1"/>
+            </wp:cNvGraphicFramePr>
+            <a:graphic xmlns:a="http://schemas.openxmlformats.org/drawingml/2006/main">
+              <a:graphicData uri="http://schemas.openxmlformats.org/drawingml/2006/picture">
+                <pic:pic xmlns:pic="http://schemas.openxmlformats.org/drawingml/2006/picture">
+                  <pic:nvPicPr>
+                    <pic:cNvPr id="350037781" name=""/>
+                    <pic:cNvPicPr/>
+                  </pic:nvPicPr>
+                  <pic:blipFill>
+                    <a:blip r:embed="rId18"/>
+                    <a:stretch>
+                      <a:fillRect/>
+                    </a:stretch>
+                  </pic:blipFill>
+                  <pic:spPr>
+                    <a:xfrm>
+                      <a:off x="0" y="0"/>
+                      <a:ext cx="5727700" cy="4127500"/>
+                    </a:xfrm>
+                    <a:prstGeom prst="rect">
+                      <a:avLst/>
+                    </a:prstGeom>
+                  </pic:spPr>
+                </pic:pic>
+              </a:graphicData>
+            </a:graphic>
+          </wp:inline>
+        </w:drawing>
+      </w:r>
+    </w:p>
+    <w:p>
+      <w:r>
+        <w:t xml:space="preserve">By </w:t>
+      </w:r>
+      <w:r>
+        <w:t xml:space="preserve">inner </w:t>
+      </w:r>
+      <w:r>
+        <w:t xml:space="preserve">joining reviews table and </w:t>
+      </w:r>
+      <w:proofErr w:type="spellStart"/>
+      <w:r>
+        <w:t>review_images</w:t>
+      </w:r>
+      <w:proofErr w:type="spellEnd"/>
+      <w:r>
+        <w:t xml:space="preserve"> table, we can see which reviews have images</w:t>
+      </w:r>
+      <w:r>
+        <w:t>.</w:t>
+      </w:r>
+    </w:p>
+    <w:p>
+      <w:r>
+        <w:rPr>
+          <w:noProof/>
+        </w:rPr>
+        <w:lastRenderedPageBreak/>
+        <w:drawing>
+          <wp:inline distT="0" distB="0" distL="0" distR="0" wp14:anchorId="51B08ADC" wp14:editId="5CD62B4E">
+            <wp:extent cx="5943600" cy="3622040"/>
+            <wp:effectExtent l="0" t="0" r="0" b="0"/>
+            <wp:docPr id="152045241" name="Picture 1"/>
+            <wp:cNvGraphicFramePr>
+              <a:graphicFrameLocks xmlns:a="http://schemas.openxmlformats.org/drawingml/2006/main" noChangeAspect="1"/>
+            </wp:cNvGraphicFramePr>
+            <a:graphic xmlns:a="http://schemas.openxmlformats.org/drawingml/2006/main">
+              <a:graphicData uri="http://schemas.openxmlformats.org/drawingml/2006/picture">
+                <pic:pic xmlns:pic="http://schemas.openxmlformats.org/drawingml/2006/picture">
+                  <pic:nvPicPr>
+                    <pic:cNvPr id="152045241" name=""/>
+                    <pic:cNvPicPr/>
+                  </pic:nvPicPr>
+                  <pic:blipFill>
+                    <a:blip r:embed="rId19"/>
+                    <a:stretch>
+                      <a:fillRect/>
+                    </a:stretch>
+                  </pic:blipFill>
+                  <pic:spPr>
+                    <a:xfrm>
+                      <a:off x="0" y="0"/>
+                      <a:ext cx="5943600" cy="3622040"/>
+                    </a:xfrm>
+                    <a:prstGeom prst="rect">
+                      <a:avLst/>
+                    </a:prstGeom>
+                  </pic:spPr>
+                </pic:pic>
+              </a:graphicData>
+            </a:graphic>
+          </wp:inline>
+        </w:drawing>
+      </w:r>
+    </w:p>
+    <w:p>
+      <w:r>
+        <w:t xml:space="preserve">By inner joining </w:t>
+      </w:r>
+      <w:proofErr w:type="spellStart"/>
+      <w:r>
+        <w:t>review_votes</w:t>
+      </w:r>
+      <w:proofErr w:type="spellEnd"/>
+      <w:r>
+        <w:t xml:space="preserve"> table and users table, we can check each </w:t>
+      </w:r>
+      <w:proofErr w:type="gramStart"/>
+      <w:r>
+        <w:t>users</w:t>
+      </w:r>
+      <w:proofErr w:type="gramEnd"/>
+      <w:r>
+        <w:t xml:space="preserve"> who has voted on reviews.</w:t>
+      </w:r>
+    </w:p>
+    <w:p>
+      <w:r>
+        <w:rPr>
+          <w:noProof/>
+        </w:rPr>
+        <w:lastRenderedPageBreak/>
+        <w:drawing>
+          <wp:inline distT="0" distB="0" distL="0" distR="0" wp14:anchorId="29E4872A" wp14:editId="3F2224A2">
+            <wp:extent cx="5867400" cy="4191000"/>
+            <wp:effectExtent l="0" t="0" r="0" b="0"/>
+            <wp:docPr id="1927593427" name="Picture 1"/>
+            <wp:cNvGraphicFramePr>
+              <a:graphicFrameLocks xmlns:a="http://schemas.openxmlformats.org/drawingml/2006/main" noChangeAspect="1"/>
+            </wp:cNvGraphicFramePr>
+            <a:graphic xmlns:a="http://schemas.openxmlformats.org/drawingml/2006/main">
+              <a:graphicData uri="http://schemas.openxmlformats.org/drawingml/2006/picture">
+                <pic:pic xmlns:pic="http://schemas.openxmlformats.org/drawingml/2006/picture">
+                  <pic:nvPicPr>
+                    <pic:cNvPr id="1927593427" name=""/>
+                    <pic:cNvPicPr/>
+                  </pic:nvPicPr>
+                  <pic:blipFill>
+                    <a:blip r:embed="rId20"/>
+                    <a:stretch>
+                      <a:fillRect/>
+                    </a:stretch>
+                  </pic:blipFill>
+                  <pic:spPr>
+                    <a:xfrm>
+                      <a:off x="0" y="0"/>
+                      <a:ext cx="5867400" cy="4191000"/>
+                    </a:xfrm>
+                    <a:prstGeom prst="rect">
+                      <a:avLst/>
+                    </a:prstGeom>
+                  </pic:spPr>
+                </pic:pic>
+              </a:graphicData>
+            </a:graphic>
+          </wp:inline>
+        </w:drawing>
+      </w:r>
+    </w:p>
     <w:p/>
     <w:sectPr>
       <w:pgSz w:w="12240" w:h="15840"/>
@@ -1205,6 +1502,92 @@
 <file path=word/numbering.xml><?xml version="1.0" encoding="utf-8"?>
 <w:numbering xmlns:wpc="http://schemas.microsoft.com/office/word/2010/wordprocessingCanvas" xmlns:cx="http://schemas.microsoft.com/office/drawing/2014/chartex" xmlns:cx1="http://schemas.microsoft.com/office/drawing/2015/9/8/chartex" xmlns:cx2="http://schemas.microsoft.com/office/drawing/2015/10/21/chartex" xmlns:cx3="http://schemas.microsoft.com/office/drawing/2016/5/9/chartex" xmlns:cx4="http://schemas.microsoft.com/office/drawing/2016/5/10/chartex" xmlns:cx5="http://schemas.microsoft.com/office/drawing/2016/5/11/chartex" xmlns:cx6="http://schemas.microsoft.com/office/drawing/2016/5/12/chartex" xmlns:cx7="http://schemas.microsoft.com/office/drawing/2016/5/13/chartex" xmlns:cx8="http://schemas.microsoft.com/office/drawing/2016/5/14/chartex" xmlns:mc="http://schemas.openxmlformats.org/markup-compatibility/2006" xmlns:aink="http://schemas.microsoft.com/office/drawing/2016/ink" xmlns:am3d="http://schemas.microsoft.com/office/drawing/2017/model3d" xmlns:o="urn:schemas-microsoft-com:office:office" xmlns:oel="http://schemas.microsoft.com/office/2019/extlst" xmlns:r="http://schemas.openxmlformats.org/officeDocument/2006/relationships" xmlns:m="http://schemas.openxmlformats.org/officeDocument/2006/math" xmlns:v="urn:schemas-microsoft-com:vml" xmlns:wp14="http://schemas.microsoft.com/office/word/2010/wordprocessingDrawing" xmlns:wp="http://schemas.openxmlformats.org/drawingml/2006/wordprocessingDrawing" xmlns:w10="urn:schemas-microsoft-com:office:word" xmlns:w="http://schemas.openxmlformats.org/wordprocessingml/2006/main" xmlns:w14="http://schemas.microsoft.com/office/word/2010/wordml" xmlns:w15="http://schemas.microsoft.com/office/word/2012/wordml" xmlns:w16cex="http://schemas.microsoft.com/office/word/2018/wordml/cex" xmlns:w16cid="http://schemas.microsoft.com/office/word/2016/wordml/cid" xmlns:w16="http://schemas.microsoft.com/office/word/2018/wordml" xmlns:w16du="http://schemas.microsoft.com/office/word/2023/wordml/word16du" xmlns:w16sdtdh="http://schemas.microsoft.com/office/word/2020/wordml/sdtdatahash" xmlns:w16sdtfl="http://schemas.microsoft.com/office/word/2024/wordml/sdtformatlock" xmlns:w16se="http://schemas.microsoft.com/office/word/2015/wordml/symex" xmlns:wpg="http://schemas.microsoft.com/office/word/2010/wordprocessingGroup" xmlns:wpi="http://schemas.microsoft.com/office/word/2010/wordprocessingInk" xmlns:wne="http://schemas.microsoft.com/office/word/2006/wordml" xmlns:wps="http://schemas.microsoft.com/office/word/2010/wordprocessingShape" mc:Ignorable="w14 w15 w16se w16cid w16 w16cex w16sdtdh w16sdtfl w16du wp14">
   <w:abstractNum w:abstractNumId="0" w15:restartNumberingAfterBreak="0">
+    <w:nsid w:val="78A47707"/>
+    <w:multiLevelType w:val="hybridMultilevel"/>
+    <w:tmpl w:val="2B362EC0"/>
+    <w:lvl w:ilvl="0" w:tplc="0409000F">
+      <w:start w:val="1"/>
+      <w:numFmt w:val="decimal"/>
+      <w:lvlText w:val="%1."/>
+      <w:lvlJc w:val="left"/>
+      <w:pPr>
+        <w:ind w:left="720" w:hanging="360"/>
+      </w:pPr>
+    </w:lvl>
+    <w:lvl w:ilvl="1" w:tplc="04090019" w:tentative="1">
+      <w:start w:val="1"/>
+      <w:numFmt w:val="lowerLetter"/>
+      <w:lvlText w:val="%2."/>
+      <w:lvlJc w:val="left"/>
+      <w:pPr>
+        <w:ind w:left="1440" w:hanging="360"/>
+      </w:pPr>
+    </w:lvl>
+    <w:lvl w:ilvl="2" w:tplc="0409001B" w:tentative="1">
+      <w:start w:val="1"/>
+      <w:numFmt w:val="lowerRoman"/>
+      <w:lvlText w:val="%3."/>
+      <w:lvlJc w:val="right"/>
+      <w:pPr>
+        <w:ind w:left="2160" w:hanging="180"/>
+      </w:pPr>
+    </w:lvl>
+    <w:lvl w:ilvl="3" w:tplc="0409000F" w:tentative="1">
+      <w:start w:val="1"/>
+      <w:numFmt w:val="decimal"/>
+      <w:lvlText w:val="%4."/>
+      <w:lvlJc w:val="left"/>
+      <w:pPr>
+        <w:ind w:left="2880" w:hanging="360"/>
+      </w:pPr>
+    </w:lvl>
+    <w:lvl w:ilvl="4" w:tplc="04090019" w:tentative="1">
+      <w:start w:val="1"/>
+      <w:numFmt w:val="lowerLetter"/>
+      <w:lvlText w:val="%5."/>
+      <w:lvlJc w:val="left"/>
+      <w:pPr>
+        <w:ind w:left="3600" w:hanging="360"/>
+      </w:pPr>
+    </w:lvl>
+    <w:lvl w:ilvl="5" w:tplc="0409001B" w:tentative="1">
+      <w:start w:val="1"/>
+      <w:numFmt w:val="lowerRoman"/>
+      <w:lvlText w:val="%6."/>
+      <w:lvlJc w:val="right"/>
+      <w:pPr>
+        <w:ind w:left="4320" w:hanging="180"/>
+      </w:pPr>
+    </w:lvl>
+    <w:lvl w:ilvl="6" w:tplc="0409000F" w:tentative="1">
+      <w:start w:val="1"/>
+      <w:numFmt w:val="decimal"/>
+      <w:lvlText w:val="%7."/>
+      <w:lvlJc w:val="left"/>
+      <w:pPr>
+        <w:ind w:left="5040" w:hanging="360"/>
+      </w:pPr>
+    </w:lvl>
+    <w:lvl w:ilvl="7" w:tplc="04090019" w:tentative="1">
+      <w:start w:val="1"/>
+      <w:numFmt w:val="lowerLetter"/>
+      <w:lvlText w:val="%8."/>
+      <w:lvlJc w:val="left"/>
+      <w:pPr>
+        <w:ind w:left="5760" w:hanging="360"/>
+      </w:pPr>
+    </w:lvl>
+    <w:lvl w:ilvl="8" w:tplc="0409001B" w:tentative="1">
+      <w:start w:val="1"/>
+      <w:numFmt w:val="lowerRoman"/>
+      <w:lvlText w:val="%9."/>
+      <w:lvlJc w:val="right"/>
+      <w:pPr>
+        <w:ind w:left="6480" w:hanging="180"/>
+      </w:pPr>
+    </w:lvl>
+  </w:abstractNum>
+  <w:abstractNum w:abstractNumId="1" w15:restartNumberingAfterBreak="0">
     <w:nsid w:val="7EB9538A"/>
     <w:multiLevelType w:val="hybridMultilevel"/>
     <w:tmpl w:val="1C38F910"/>
@@ -1317,6 +1700,9 @@
     </w:lvl>
   </w:abstractNum>
   <w:num w:numId="1" w16cid:durableId="1815835724">
+    <w:abstractNumId w:val="1"/>
+  </w:num>
+  <w:num w:numId="2" w16cid:durableId="1086920027">
     <w:abstractNumId w:val="0"/>
   </w:num>
 </w:numbering>

</xml_diff>

<commit_message>
Update the report and its pdf versioin
</commit_message>
<xml_diff>
--- a/docs/CS 630 Final Project.docx
+++ b/docs/CS 630 Final Project.docx
@@ -6,88 +6,472 @@
       <w:pPr>
         <w:jc w:val="center"/>
         <w:rPr>
-          <w:rFonts w:eastAsia="Times New Roman" w:cs="Times New Roman"/>
-          <w:color w:val="000000"/>
-          <w:kern w:val="0"/>
-          <w14:ligatures w14:val="none"/>
-        </w:rPr>
-      </w:pPr>
-      <w:r>
-        <w:rPr>
-          <w:rFonts w:cs="Times New Roman"/>
-        </w:rPr>
-        <w:t xml:space="preserve">CS 630 Final Project - </w:t>
-      </w:r>
-      <w:r>
-        <w:rPr>
-          <w:rFonts w:eastAsia="Times New Roman" w:cs="Times New Roman"/>
-          <w:color w:val="000000"/>
-          <w:kern w:val="0"/>
-          <w14:ligatures w14:val="none"/>
-        </w:rPr>
-        <w:t>Product Review &amp; Rating Platform</w:t>
-      </w:r>
-    </w:p>
-    <w:p>
-      <w:r>
+          <w:rFonts w:cs="Times New Roman"/>
+        </w:rPr>
+      </w:pPr>
+    </w:p>
+    <w:p>
+      <w:pPr>
+        <w:jc w:val="center"/>
+        <w:rPr>
+          <w:rFonts w:cs="Times New Roman"/>
+        </w:rPr>
+      </w:pPr>
+    </w:p>
+    <w:p>
+      <w:pPr>
+        <w:jc w:val="center"/>
+        <w:rPr>
+          <w:rFonts w:cs="Times New Roman"/>
+        </w:rPr>
+      </w:pPr>
+    </w:p>
+    <w:p>
+      <w:pPr>
+        <w:jc w:val="center"/>
+        <w:rPr>
+          <w:rFonts w:cs="Times New Roman"/>
+        </w:rPr>
+      </w:pPr>
+    </w:p>
+    <w:p>
+      <w:pPr>
+        <w:jc w:val="center"/>
+        <w:rPr>
+          <w:rFonts w:cs="Times New Roman"/>
+        </w:rPr>
+      </w:pPr>
+    </w:p>
+    <w:p>
+      <w:pPr>
+        <w:jc w:val="center"/>
+        <w:rPr>
+          <w:rFonts w:cs="Times New Roman"/>
+        </w:rPr>
+      </w:pPr>
+    </w:p>
+    <w:p>
+      <w:pPr>
+        <w:jc w:val="center"/>
+        <w:rPr>
+          <w:rFonts w:cs="Times New Roman"/>
+          <w:b/>
+          <w:bCs/>
+        </w:rPr>
+      </w:pPr>
+      <w:r>
+        <w:rPr>
+          <w:rFonts w:cs="Times New Roman"/>
+          <w:b/>
+          <w:bCs/>
+        </w:rPr>
+        <w:t xml:space="preserve">Product Review &amp; Rating Platform </w:t>
+      </w:r>
+    </w:p>
+    <w:p>
+      <w:pPr>
+        <w:jc w:val="center"/>
+        <w:rPr>
+          <w:rFonts w:cs="Times New Roman"/>
+          <w:color w:val="000000" w:themeColor="text1"/>
+        </w:rPr>
+      </w:pPr>
+      <w:r>
+        <w:rPr>
+          <w:rFonts w:cs="Times New Roman"/>
+          <w:color w:val="000000" w:themeColor="text1"/>
+        </w:rPr>
+        <w:t>Yucen Wang</w:t>
+      </w:r>
+    </w:p>
+    <w:p>
+      <w:pPr>
+        <w:jc w:val="center"/>
+        <w:rPr>
+          <w:rFonts w:cs="Times New Roman"/>
+        </w:rPr>
+      </w:pPr>
+      <w:r>
+        <w:rPr>
+          <w:rFonts w:cs="Times New Roman"/>
+        </w:rPr>
+        <w:t>Department of Information Technology, Monroe University, King Graduate School</w:t>
+      </w:r>
+    </w:p>
+    <w:p>
+      <w:pPr>
+        <w:jc w:val="center"/>
+        <w:rPr>
+          <w:rFonts w:cs="Times New Roman"/>
+          <w:color w:val="000000" w:themeColor="text1"/>
+        </w:rPr>
+      </w:pPr>
+      <w:r>
+        <w:rPr>
+          <w:rFonts w:cs="Times New Roman"/>
+          <w:color w:val="000000" w:themeColor="text1"/>
+        </w:rPr>
+        <w:t>KG6</w:t>
+      </w:r>
+      <w:r>
+        <w:rPr>
+          <w:rFonts w:cs="Times New Roman"/>
+          <w:color w:val="000000" w:themeColor="text1"/>
+        </w:rPr>
+        <w:t>30</w:t>
+      </w:r>
+      <w:r>
+        <w:rPr>
+          <w:rFonts w:cs="Times New Roman"/>
+          <w:color w:val="000000" w:themeColor="text1"/>
+        </w:rPr>
+        <w:t>-15</w:t>
+      </w:r>
+      <w:r>
+        <w:rPr>
+          <w:rFonts w:cs="Times New Roman"/>
+          <w:color w:val="000000" w:themeColor="text1"/>
+        </w:rPr>
+        <w:t>4</w:t>
+      </w:r>
+      <w:r>
+        <w:rPr>
+          <w:rFonts w:cs="Times New Roman"/>
+          <w:color w:val="000000" w:themeColor="text1"/>
+        </w:rPr>
+        <w:t xml:space="preserve">W: </w:t>
+      </w:r>
+      <w:r>
+        <w:rPr>
+          <w:rFonts w:cs="Times New Roman"/>
+          <w:color w:val="000000" w:themeColor="text1"/>
+        </w:rPr>
+        <w:t>Database Systems</w:t>
+      </w:r>
+    </w:p>
+    <w:p>
+      <w:pPr>
+        <w:jc w:val="center"/>
+        <w:rPr>
+          <w:rFonts w:cs="Times New Roman"/>
+          <w:color w:val="000000" w:themeColor="text1"/>
+        </w:rPr>
+      </w:pPr>
+      <w:r>
+        <w:rPr>
+          <w:rFonts w:cs="Times New Roman"/>
+          <w:color w:val="000000" w:themeColor="text1"/>
+        </w:rPr>
+        <w:t>Professor Deepthi Umesha</w:t>
+      </w:r>
+    </w:p>
+    <w:p>
+      <w:pPr>
+        <w:jc w:val="center"/>
+        <w:rPr>
+          <w:rFonts w:cs="Times New Roman"/>
+          <w:color w:val="000000" w:themeColor="text1"/>
+        </w:rPr>
+      </w:pPr>
+      <w:r>
+        <w:rPr>
+          <w:rFonts w:cs="Times New Roman"/>
+          <w:color w:val="000000" w:themeColor="text1"/>
+        </w:rPr>
+        <w:t>April 13, 2026</w:t>
+      </w:r>
+    </w:p>
+    <w:p>
+      <w:pPr>
+        <w:jc w:val="center"/>
+        <w:rPr>
+          <w:rFonts w:cs="Times New Roman"/>
+        </w:rPr>
+      </w:pPr>
+    </w:p>
+    <w:p>
+      <w:pPr>
+        <w:jc w:val="center"/>
+        <w:rPr>
+          <w:rFonts w:cs="Times New Roman"/>
+        </w:rPr>
+      </w:pPr>
+    </w:p>
+    <w:p>
+      <w:pPr>
+        <w:jc w:val="center"/>
+        <w:rPr>
+          <w:rFonts w:cs="Times New Roman"/>
+        </w:rPr>
+      </w:pPr>
+    </w:p>
+    <w:p>
+      <w:pPr>
+        <w:jc w:val="center"/>
+        <w:rPr>
+          <w:rFonts w:cs="Times New Roman"/>
+        </w:rPr>
+      </w:pPr>
+    </w:p>
+    <w:p>
+      <w:pPr>
+        <w:jc w:val="center"/>
+        <w:rPr>
+          <w:rFonts w:cs="Times New Roman"/>
+        </w:rPr>
+      </w:pPr>
+    </w:p>
+    <w:p>
+      <w:pPr>
+        <w:jc w:val="center"/>
+        <w:rPr>
+          <w:rFonts w:cs="Times New Roman"/>
+        </w:rPr>
+      </w:pPr>
+    </w:p>
+    <w:p>
+      <w:pPr>
+        <w:jc w:val="center"/>
+        <w:rPr>
+          <w:rFonts w:cs="Times New Roman"/>
+        </w:rPr>
+      </w:pPr>
+    </w:p>
+    <w:p>
+      <w:pPr>
+        <w:jc w:val="center"/>
+        <w:rPr>
+          <w:rFonts w:cs="Times New Roman"/>
+        </w:rPr>
+      </w:pPr>
+    </w:p>
+    <w:p>
+      <w:pPr>
+        <w:jc w:val="center"/>
+        <w:rPr>
+          <w:rFonts w:cs="Times New Roman"/>
+        </w:rPr>
+      </w:pPr>
+    </w:p>
+    <w:p>
+      <w:pPr>
+        <w:jc w:val="center"/>
+        <w:rPr>
+          <w:rFonts w:cs="Times New Roman"/>
+        </w:rPr>
+      </w:pPr>
+    </w:p>
+    <w:p>
+      <w:pPr>
+        <w:jc w:val="center"/>
+        <w:rPr>
+          <w:rFonts w:cs="Times New Roman"/>
+        </w:rPr>
+      </w:pPr>
+    </w:p>
+    <w:p>
+      <w:pPr>
+        <w:jc w:val="center"/>
+        <w:rPr>
+          <w:rFonts w:cs="Times New Roman"/>
+          <w:b/>
+          <w:bCs/>
+        </w:rPr>
+      </w:pPr>
+      <w:r>
+        <w:rPr>
+          <w:rFonts w:cs="Times New Roman"/>
+          <w:b/>
+          <w:bCs/>
+        </w:rPr>
+        <w:lastRenderedPageBreak/>
+        <w:t xml:space="preserve">Product Review &amp; Rating Platform </w:t>
+      </w:r>
+    </w:p>
+    <w:p>
+      <w:pPr>
+        <w:rPr>
+          <w:rFonts w:cs="Times New Roman"/>
+          <w:b/>
+          <w:bCs/>
+        </w:rPr>
+      </w:pPr>
+      <w:r>
+        <w:rPr>
+          <w:rFonts w:cs="Times New Roman"/>
+          <w:b/>
+          <w:bCs/>
+        </w:rPr>
         <w:t>Summary</w:t>
       </w:r>
     </w:p>
     <w:p>
-      <w:r>
+      <w:pPr>
+        <w:rPr>
+          <w:rFonts w:cs="Times New Roman"/>
+        </w:rPr>
+      </w:pPr>
+      <w:r>
+        <w:rPr>
+          <w:rFonts w:cs="Times New Roman"/>
+        </w:rPr>
         <w:t xml:space="preserve">This project creates a database design for a product review and rating platform. The database </w:t>
       </w:r>
       <w:r>
+        <w:rPr>
+          <w:rFonts w:cs="Times New Roman"/>
+        </w:rPr>
         <w:t>includes</w:t>
       </w:r>
       <w:r>
-        <w:t xml:space="preserve"> users, products, brands, categories, reviews, review votes and review images tables.</w:t>
-      </w:r>
-    </w:p>
-    <w:p>
-      <w:r>
+        <w:rPr>
+          <w:rFonts w:cs="Times New Roman"/>
+        </w:rPr>
+        <w:t xml:space="preserve"> users, products, brands, categories, reviews, </w:t>
+      </w:r>
+      <w:r>
+        <w:rPr>
+          <w:rFonts w:cs="Times New Roman"/>
+        </w:rPr>
+        <w:t>review votes</w:t>
+      </w:r>
+      <w:r>
+        <w:rPr>
+          <w:rFonts w:cs="Times New Roman"/>
+        </w:rPr>
+        <w:t xml:space="preserve"> and review</w:t>
+      </w:r>
+      <w:r>
+        <w:rPr>
+          <w:rFonts w:cs="Times New Roman"/>
+        </w:rPr>
+        <w:t xml:space="preserve"> </w:t>
+      </w:r>
+      <w:r>
+        <w:rPr>
+          <w:rFonts w:cs="Times New Roman"/>
+        </w:rPr>
+        <w:t>images tables.</w:t>
+      </w:r>
+      <w:r>
+        <w:rPr>
+          <w:rFonts w:cs="Times New Roman"/>
+        </w:rPr>
+        <w:t xml:space="preserve"> The design </w:t>
+      </w:r>
+      <w:r>
+        <w:rPr>
+          <w:rFonts w:cs="Times New Roman"/>
+        </w:rPr>
         <w:t>focuses on data integrity, normalization to 3NF, and practical review</w:t>
       </w:r>
       <w:r>
+        <w:rPr>
+          <w:rFonts w:cs="Times New Roman"/>
+        </w:rPr>
         <w:t xml:space="preserve"> </w:t>
       </w:r>
       <w:r>
+        <w:rPr>
+          <w:rFonts w:cs="Times New Roman"/>
+        </w:rPr>
         <w:t xml:space="preserve">analysis </w:t>
       </w:r>
       <w:r>
+        <w:rPr>
+          <w:rFonts w:cs="Times New Roman"/>
+        </w:rPr>
         <w:t xml:space="preserve">of </w:t>
       </w:r>
       <w:r>
+        <w:rPr>
+          <w:rFonts w:cs="Times New Roman"/>
+        </w:rPr>
         <w:t>use cases.</w:t>
       </w:r>
     </w:p>
     <w:p>
-      <w:r>
+      <w:pPr>
+        <w:rPr>
+          <w:rFonts w:cs="Times New Roman"/>
+          <w:b/>
+          <w:bCs/>
+        </w:rPr>
+      </w:pPr>
+      <w:r>
+        <w:rPr>
+          <w:rFonts w:cs="Times New Roman"/>
+          <w:b/>
+          <w:bCs/>
+        </w:rPr>
         <w:t>Introduction</w:t>
       </w:r>
     </w:p>
     <w:p>
-      <w:r>
+      <w:pPr>
+        <w:rPr>
+          <w:rFonts w:cs="Times New Roman"/>
+        </w:rPr>
+      </w:pPr>
+      <w:r>
+        <w:rPr>
+          <w:rFonts w:cs="Times New Roman"/>
+        </w:rPr>
         <w:t xml:space="preserve">Websites like Amazon allow customers to leave product reviews, give rating scores, and vote on whether a review is helpful. I chose this project to model a similar system and show how an Oracle database can store and manage products, users, reviews, ratings, and review votes using </w:t>
       </w:r>
       <w:r>
+        <w:rPr>
+          <w:rFonts w:cs="Times New Roman"/>
+        </w:rPr>
         <w:t>database design</w:t>
       </w:r>
       <w:r>
+        <w:rPr>
+          <w:rFonts w:cs="Times New Roman"/>
+        </w:rPr>
         <w:t xml:space="preserve"> </w:t>
       </w:r>
       <w:r>
+        <w:rPr>
+          <w:rFonts w:cs="Times New Roman"/>
+        </w:rPr>
         <w:t>and sample data.</w:t>
       </w:r>
     </w:p>
     <w:p>
-      <w:r>
+      <w:pPr>
+        <w:ind w:firstLine="720"/>
+        <w:rPr>
+          <w:rFonts w:cs="Times New Roman"/>
+        </w:rPr>
+      </w:pPr>
+    </w:p>
+    <w:p>
+      <w:pPr>
+        <w:rPr>
+          <w:rFonts w:cs="Times New Roman"/>
+          <w:b/>
+          <w:bCs/>
+        </w:rPr>
+      </w:pPr>
+      <w:r>
+        <w:rPr>
+          <w:rFonts w:cs="Times New Roman"/>
+          <w:b/>
+          <w:bCs/>
+        </w:rPr>
         <w:t>ER Diagram</w:t>
       </w:r>
     </w:p>
     <w:p>
-      <w:r>
-        <w:rPr>
+      <w:pPr>
+        <w:rPr>
+          <w:rFonts w:cs="Times New Roman"/>
+        </w:rPr>
+      </w:pPr>
+      <w:r>
+        <w:rPr>
+          <w:rFonts w:cs="Times New Roman"/>
           <w:noProof/>
         </w:rPr>
         <w:lastRenderedPageBreak/>
@@ -107,7 +491,7 @@
                     <pic:cNvPicPr/>
                   </pic:nvPicPr>
                   <pic:blipFill>
-                    <a:blip r:embed="rId5"/>
+                    <a:blip r:embed="rId7"/>
                     <a:stretch>
                       <a:fillRect/>
                     </a:stretch>
@@ -129,107 +513,189 @@
       </w:r>
     </w:p>
     <w:p>
-      <w:r>
-        <w:t>There are 7 tables in this database, represented as 7 entities in the ER diagram.</w:t>
-      </w:r>
-      <w:r>
-        <w:t xml:space="preserve"> </w:t>
-      </w:r>
-      <w:r>
-        <w:t>A single category or brand can be associated with many products, while each product belongs to only one category and one brand.</w:t>
-      </w:r>
-      <w:r>
-        <w:t xml:space="preserve"> </w:t>
-      </w:r>
-      <w:r>
+      <w:pPr>
+        <w:rPr>
+          <w:rFonts w:cs="Times New Roman"/>
+        </w:rPr>
+      </w:pPr>
+      <w:r>
+        <w:rPr>
+          <w:rFonts w:cs="Times New Roman"/>
+        </w:rPr>
+        <w:t xml:space="preserve">There are 7 tables in this database, represented as 7 entities in the ER diagram. A single category or brand can be associated with many products, while each product belongs to only one category and one brand. </w:t>
+      </w:r>
+      <w:r>
+        <w:rPr>
+          <w:rFonts w:cs="Times New Roman"/>
+        </w:rPr>
         <w:t xml:space="preserve">Each product receives more than one review, but that review only links to the specific product. </w:t>
       </w:r>
       <w:r>
+        <w:rPr>
+          <w:rFonts w:cs="Times New Roman"/>
+        </w:rPr>
         <w:t xml:space="preserve">One user can write many reviews and cast many review votes. </w:t>
       </w:r>
       <w:r>
+        <w:rPr>
+          <w:rFonts w:cs="Times New Roman"/>
+        </w:rPr>
         <w:t xml:space="preserve">Each </w:t>
       </w:r>
       <w:r>
+        <w:rPr>
+          <w:rFonts w:cs="Times New Roman"/>
+        </w:rPr>
         <w:t>review can include multiple images and have multiple review votes</w:t>
       </w:r>
       <w:r>
+        <w:rPr>
+          <w:rFonts w:cs="Times New Roman"/>
+        </w:rPr>
         <w:t>, whereas o</w:t>
       </w:r>
       <w:r>
+        <w:rPr>
+          <w:rFonts w:cs="Times New Roman"/>
+        </w:rPr>
         <w:t xml:space="preserve">ne review vote or one review image </w:t>
       </w:r>
       <w:r>
+        <w:rPr>
+          <w:rFonts w:cs="Times New Roman"/>
+        </w:rPr>
         <w:t>is</w:t>
       </w:r>
       <w:r>
+        <w:rPr>
+          <w:rFonts w:cs="Times New Roman"/>
+        </w:rPr>
         <w:t xml:space="preserve"> linked to one specific review.</w:t>
       </w:r>
     </w:p>
-    <w:p/>
-    <w:p>
-      <w:r>
+    <w:p>
+      <w:pPr>
+        <w:rPr>
+          <w:rFonts w:cs="Times New Roman"/>
+        </w:rPr>
+      </w:pPr>
+    </w:p>
+    <w:p>
+      <w:pPr>
+        <w:rPr>
+          <w:rFonts w:cs="Times New Roman"/>
+          <w:b/>
+          <w:bCs/>
+        </w:rPr>
+      </w:pPr>
+      <w:r>
+        <w:rPr>
+          <w:rFonts w:cs="Times New Roman"/>
+          <w:b/>
+          <w:bCs/>
+        </w:rPr>
         <w:t>Data Modeling</w:t>
       </w:r>
     </w:p>
     <w:p>
-      <w:r>
+      <w:pPr>
+        <w:rPr>
+          <w:rFonts w:cs="Times New Roman"/>
+        </w:rPr>
+      </w:pPr>
+      <w:r>
+        <w:rPr>
+          <w:rFonts w:cs="Times New Roman"/>
+        </w:rPr>
         <w:lastRenderedPageBreak/>
         <w:t>The u</w:t>
       </w:r>
       <w:r>
-        <w:t xml:space="preserve">sers </w:t>
-      </w:r>
-      <w:r>
-        <w:t xml:space="preserve">table </w:t>
-      </w:r>
-      <w:r>
-        <w:t>store</w:t>
-      </w:r>
-      <w:r>
+        <w:rPr>
+          <w:rFonts w:cs="Times New Roman"/>
+        </w:rPr>
+        <w:t>sers table store</w:t>
+      </w:r>
+      <w:r>
+        <w:rPr>
+          <w:rFonts w:cs="Times New Roman"/>
+        </w:rPr>
         <w:t>s</w:t>
       </w:r>
       <w:r>
-        <w:t xml:space="preserve"> reviewer account information.</w:t>
-      </w:r>
-      <w:r>
-        <w:t xml:space="preserve"> </w:t>
-      </w:r>
-      <w:r>
+        <w:rPr>
+          <w:rFonts w:cs="Times New Roman"/>
+        </w:rPr>
+        <w:t xml:space="preserve"> reviewer account information. </w:t>
+      </w:r>
+      <w:r>
+        <w:rPr>
+          <w:rFonts w:cs="Times New Roman"/>
+        </w:rPr>
         <w:t xml:space="preserve">For </w:t>
       </w:r>
       <w:r>
+        <w:rPr>
+          <w:rFonts w:cs="Times New Roman"/>
+        </w:rPr>
         <w:t>this</w:t>
       </w:r>
       <w:r>
+        <w:rPr>
+          <w:rFonts w:cs="Times New Roman"/>
+        </w:rPr>
         <w:t xml:space="preserve"> table, </w:t>
       </w:r>
       <w:proofErr w:type="spellStart"/>
       <w:r>
+        <w:rPr>
+          <w:rFonts w:cs="Times New Roman"/>
+        </w:rPr>
         <w:t>user_id</w:t>
       </w:r>
       <w:proofErr w:type="spellEnd"/>
       <w:r>
+        <w:rPr>
+          <w:rFonts w:cs="Times New Roman"/>
+        </w:rPr>
         <w:t xml:space="preserve"> is the unique primary key. </w:t>
       </w:r>
       <w:r>
+        <w:rPr>
+          <w:rFonts w:cs="Times New Roman"/>
+        </w:rPr>
         <w:t>The username and email are set as unique keys to avoid any confusion.</w:t>
       </w:r>
       <w:r>
+        <w:rPr>
+          <w:rFonts w:cs="Times New Roman"/>
+        </w:rPr>
         <w:t xml:space="preserve"> Each user can set his or her password and the created time saved in the </w:t>
       </w:r>
       <w:proofErr w:type="gramStart"/>
       <w:r>
+        <w:rPr>
+          <w:rFonts w:cs="Times New Roman"/>
+        </w:rPr>
         <w:t>users</w:t>
       </w:r>
       <w:proofErr w:type="gramEnd"/>
       <w:r>
+        <w:rPr>
+          <w:rFonts w:cs="Times New Roman"/>
+        </w:rPr>
         <w:t xml:space="preserve"> table. </w:t>
       </w:r>
     </w:p>
     <w:p>
-      <w:r>
-        <w:rPr>
+      <w:pPr>
+        <w:rPr>
+          <w:rFonts w:cs="Times New Roman"/>
+        </w:rPr>
+      </w:pPr>
+      <w:r>
+        <w:rPr>
+          <w:rFonts w:cs="Times New Roman"/>
           <w:noProof/>
         </w:rPr>
         <w:drawing>
@@ -248,7 +714,7 @@
                     <pic:cNvPicPr/>
                   </pic:nvPicPr>
                   <pic:blipFill>
-                    <a:blip r:embed="rId6"/>
+                    <a:blip r:embed="rId8"/>
                     <a:stretch>
                       <a:fillRect/>
                     </a:stretch>
@@ -270,41 +736,79 @@
       </w:r>
     </w:p>
     <w:p>
-      <w:r>
+      <w:pPr>
+        <w:rPr>
+          <w:rFonts w:cs="Times New Roman"/>
+        </w:rPr>
+      </w:pPr>
+      <w:r>
+        <w:rPr>
+          <w:rFonts w:cs="Times New Roman"/>
+        </w:rPr>
         <w:t xml:space="preserve">The </w:t>
       </w:r>
       <w:r>
+        <w:rPr>
+          <w:rFonts w:cs="Times New Roman"/>
+        </w:rPr>
         <w:t>b</w:t>
       </w:r>
       <w:r>
+        <w:rPr>
+          <w:rFonts w:cs="Times New Roman"/>
+        </w:rPr>
         <w:t>rands table records the product brand.</w:t>
       </w:r>
       <w:r>
+        <w:rPr>
+          <w:rFonts w:cs="Times New Roman"/>
+        </w:rPr>
         <w:t xml:space="preserve"> </w:t>
       </w:r>
       <w:proofErr w:type="spellStart"/>
       <w:r>
+        <w:rPr>
+          <w:rFonts w:cs="Times New Roman"/>
+        </w:rPr>
         <w:t>Brand_is</w:t>
       </w:r>
       <w:proofErr w:type="spellEnd"/>
       <w:r>
+        <w:rPr>
+          <w:rFonts w:cs="Times New Roman"/>
+        </w:rPr>
         <w:t xml:space="preserve"> is the primary key for the table</w:t>
       </w:r>
       <w:r>
+        <w:rPr>
+          <w:rFonts w:cs="Times New Roman"/>
+        </w:rPr>
         <w:t xml:space="preserve"> and </w:t>
       </w:r>
       <w:proofErr w:type="spellStart"/>
       <w:r>
+        <w:rPr>
+          <w:rFonts w:cs="Times New Roman"/>
+        </w:rPr>
         <w:t>brand_name</w:t>
       </w:r>
       <w:proofErr w:type="spellEnd"/>
       <w:r>
+        <w:rPr>
+          <w:rFonts w:cs="Times New Roman"/>
+        </w:rPr>
         <w:t xml:space="preserve"> should be unique.</w:t>
       </w:r>
     </w:p>
     <w:p>
-      <w:r>
-        <w:rPr>
+      <w:pPr>
+        <w:rPr>
+          <w:rFonts w:cs="Times New Roman"/>
+        </w:rPr>
+      </w:pPr>
+      <w:r>
+        <w:rPr>
+          <w:rFonts w:cs="Times New Roman"/>
           <w:noProof/>
         </w:rPr>
         <w:drawing>
@@ -323,7 +827,7 @@
                     <pic:cNvPicPr/>
                   </pic:nvPicPr>
                   <pic:blipFill>
-                    <a:blip r:embed="rId7"/>
+                    <a:blip r:embed="rId9"/>
                     <a:stretch>
                       <a:fillRect/>
                     </a:stretch>
@@ -345,38 +849,73 @@
       </w:r>
     </w:p>
     <w:p>
-      <w:r>
+      <w:pPr>
+        <w:rPr>
+          <w:rFonts w:cs="Times New Roman"/>
+        </w:rPr>
+      </w:pPr>
+      <w:r>
+        <w:rPr>
+          <w:rFonts w:cs="Times New Roman"/>
+        </w:rPr>
         <w:t>The categor</w:t>
       </w:r>
       <w:r>
+        <w:rPr>
+          <w:rFonts w:cs="Times New Roman"/>
+        </w:rPr>
         <w:t>ies</w:t>
       </w:r>
       <w:r>
+        <w:rPr>
+          <w:rFonts w:cs="Times New Roman"/>
+        </w:rPr>
         <w:t xml:space="preserve"> table records products’ categories. </w:t>
       </w:r>
       <w:proofErr w:type="spellStart"/>
       <w:r>
+        <w:rPr>
+          <w:rFonts w:cs="Times New Roman"/>
+        </w:rPr>
         <w:t>Category_id</w:t>
       </w:r>
       <w:proofErr w:type="spellEnd"/>
       <w:r>
+        <w:rPr>
+          <w:rFonts w:cs="Times New Roman"/>
+        </w:rPr>
         <w:t xml:space="preserve"> is the primary key for this table</w:t>
       </w:r>
       <w:r>
+        <w:rPr>
+          <w:rFonts w:cs="Times New Roman"/>
+        </w:rPr>
         <w:t xml:space="preserve"> and </w:t>
       </w:r>
       <w:proofErr w:type="spellStart"/>
       <w:r>
+        <w:rPr>
+          <w:rFonts w:cs="Times New Roman"/>
+        </w:rPr>
         <w:t>category_name</w:t>
       </w:r>
       <w:proofErr w:type="spellEnd"/>
       <w:r>
+        <w:rPr>
+          <w:rFonts w:cs="Times New Roman"/>
+        </w:rPr>
         <w:t xml:space="preserve"> should be unique.</w:t>
       </w:r>
     </w:p>
     <w:p>
-      <w:r>
-        <w:rPr>
+      <w:pPr>
+        <w:rPr>
+          <w:rFonts w:cs="Times New Roman"/>
+        </w:rPr>
+      </w:pPr>
+      <w:r>
+        <w:rPr>
+          <w:rFonts w:cs="Times New Roman"/>
           <w:noProof/>
         </w:rPr>
         <w:drawing>
@@ -395,7 +934,7 @@
                     <pic:cNvPicPr/>
                   </pic:nvPicPr>
                   <pic:blipFill>
-                    <a:blip r:embed="rId8"/>
+                    <a:blip r:embed="rId10"/>
                     <a:stretch>
                       <a:fillRect/>
                     </a:stretch>
@@ -417,67 +956,129 @@
       </w:r>
     </w:p>
     <w:p>
-      <w:r>
+      <w:pPr>
+        <w:rPr>
+          <w:rFonts w:cs="Times New Roman"/>
+        </w:rPr>
+      </w:pPr>
+      <w:r>
+        <w:rPr>
+          <w:rFonts w:cs="Times New Roman"/>
+        </w:rPr>
         <w:t xml:space="preserve">The products table contains all </w:t>
       </w:r>
       <w:r>
+        <w:rPr>
+          <w:rFonts w:cs="Times New Roman"/>
+        </w:rPr>
         <w:t xml:space="preserve">the </w:t>
       </w:r>
       <w:r>
+        <w:rPr>
+          <w:rFonts w:cs="Times New Roman"/>
+        </w:rPr>
         <w:t>products listed</w:t>
       </w:r>
       <w:r>
+        <w:rPr>
+          <w:rFonts w:cs="Times New Roman"/>
+        </w:rPr>
         <w:t xml:space="preserve"> on the platform. </w:t>
       </w:r>
       <w:proofErr w:type="spellStart"/>
       <w:r>
+        <w:rPr>
+          <w:rFonts w:cs="Times New Roman"/>
+        </w:rPr>
         <w:t>Product_id</w:t>
       </w:r>
       <w:proofErr w:type="spellEnd"/>
       <w:r>
+        <w:rPr>
+          <w:rFonts w:cs="Times New Roman"/>
+        </w:rPr>
         <w:t xml:space="preserve"> is the primary key. </w:t>
       </w:r>
       <w:proofErr w:type="spellStart"/>
       <w:r>
+        <w:rPr>
+          <w:rFonts w:cs="Times New Roman"/>
+        </w:rPr>
         <w:t>Brand_id</w:t>
       </w:r>
       <w:proofErr w:type="spellEnd"/>
       <w:r>
+        <w:rPr>
+          <w:rFonts w:cs="Times New Roman"/>
+        </w:rPr>
         <w:t xml:space="preserve"> is a foreign key </w:t>
       </w:r>
       <w:r>
+        <w:rPr>
+          <w:rFonts w:cs="Times New Roman"/>
+        </w:rPr>
         <w:t>that</w:t>
       </w:r>
       <w:r>
+        <w:rPr>
+          <w:rFonts w:cs="Times New Roman"/>
+        </w:rPr>
         <w:t xml:space="preserve"> can connect with the brands table. </w:t>
       </w:r>
       <w:proofErr w:type="spellStart"/>
       <w:r>
+        <w:rPr>
+          <w:rFonts w:cs="Times New Roman"/>
+        </w:rPr>
         <w:t>Cat</w:t>
       </w:r>
       <w:r>
+        <w:rPr>
+          <w:rFonts w:cs="Times New Roman"/>
+        </w:rPr>
         <w:t>e</w:t>
       </w:r>
       <w:r>
+        <w:rPr>
+          <w:rFonts w:cs="Times New Roman"/>
+        </w:rPr>
         <w:t>gory_id</w:t>
       </w:r>
       <w:proofErr w:type="spellEnd"/>
       <w:r>
+        <w:rPr>
+          <w:rFonts w:cs="Times New Roman"/>
+        </w:rPr>
         <w:t xml:space="preserve"> is the second foreign key </w:t>
       </w:r>
       <w:r>
+        <w:rPr>
+          <w:rFonts w:cs="Times New Roman"/>
+        </w:rPr>
         <w:t xml:space="preserve">that </w:t>
       </w:r>
       <w:r>
+        <w:rPr>
+          <w:rFonts w:cs="Times New Roman"/>
+        </w:rPr>
         <w:t xml:space="preserve">connects with the </w:t>
       </w:r>
       <w:r>
+        <w:rPr>
+          <w:rFonts w:cs="Times New Roman"/>
+        </w:rPr>
         <w:t>categories table.</w:t>
       </w:r>
     </w:p>
     <w:p>
-      <w:r>
-        <w:rPr>
+      <w:pPr>
+        <w:rPr>
+          <w:rFonts w:cs="Times New Roman"/>
+        </w:rPr>
+      </w:pPr>
+      <w:r>
+        <w:rPr>
+          <w:rFonts w:cs="Times New Roman"/>
           <w:noProof/>
         </w:rPr>
         <w:lastRenderedPageBreak/>
@@ -497,7 +1098,7 @@
                     <pic:cNvPicPr/>
                   </pic:nvPicPr>
                   <pic:blipFill>
-                    <a:blip r:embed="rId9"/>
+                    <a:blip r:embed="rId11"/>
                     <a:stretch>
                       <a:fillRect/>
                     </a:stretch>
@@ -519,106 +1120,183 @@
       </w:r>
     </w:p>
     <w:p>
-      <w:r>
-        <w:t>The r</w:t>
-      </w:r>
-      <w:r>
-        <w:t xml:space="preserve">eviews </w:t>
-      </w:r>
-      <w:r>
-        <w:t xml:space="preserve">table </w:t>
-      </w:r>
-      <w:r>
-        <w:t>store user feedback and rating scores.</w:t>
-      </w:r>
-      <w:r>
+      <w:pPr>
+        <w:rPr>
+          <w:rFonts w:cs="Times New Roman"/>
+        </w:rPr>
+      </w:pPr>
+      <w:r>
+        <w:rPr>
+          <w:rFonts w:cs="Times New Roman"/>
+        </w:rPr>
+        <w:t xml:space="preserve">The reviews table store user feedback and rating scores. </w:t>
+      </w:r>
+      <w:proofErr w:type="spellStart"/>
+      <w:r>
+        <w:rPr>
+          <w:rFonts w:cs="Times New Roman"/>
+        </w:rPr>
+        <w:t>Review</w:t>
+      </w:r>
+      <w:r>
+        <w:rPr>
+          <w:rFonts w:cs="Times New Roman"/>
+        </w:rPr>
+        <w:t>_id</w:t>
+      </w:r>
+      <w:proofErr w:type="spellEnd"/>
+      <w:r>
+        <w:rPr>
+          <w:rFonts w:cs="Times New Roman"/>
+        </w:rPr>
         <w:t xml:space="preserve"> </w:t>
       </w:r>
+      <w:r>
+        <w:rPr>
+          <w:rFonts w:cs="Times New Roman"/>
+        </w:rPr>
+        <w:t>is</w:t>
+      </w:r>
+      <w:r>
+        <w:rPr>
+          <w:rFonts w:cs="Times New Roman"/>
+        </w:rPr>
+        <w:t xml:space="preserve"> </w:t>
+      </w:r>
+      <w:r>
+        <w:rPr>
+          <w:rFonts w:cs="Times New Roman"/>
+        </w:rPr>
+        <w:t xml:space="preserve">the </w:t>
+      </w:r>
+      <w:r>
+        <w:rPr>
+          <w:rFonts w:cs="Times New Roman"/>
+        </w:rPr>
+        <w:t>primary key, representing each review of products.</w:t>
+      </w:r>
+      <w:r>
+        <w:rPr>
+          <w:rFonts w:cs="Times New Roman"/>
+        </w:rPr>
+        <w:t xml:space="preserve"> </w:t>
+      </w:r>
       <w:proofErr w:type="spellStart"/>
       <w:r>
-        <w:t>Review</w:t>
-      </w:r>
-      <w:r>
-        <w:t>_id</w:t>
+        <w:rPr>
+          <w:rFonts w:cs="Times New Roman"/>
+        </w:rPr>
+        <w:t>Product_id</w:t>
       </w:r>
       <w:proofErr w:type="spellEnd"/>
       <w:r>
-        <w:t xml:space="preserve"> </w:t>
-      </w:r>
-      <w:r>
-        <w:t>is</w:t>
-      </w:r>
-      <w:r>
-        <w:t xml:space="preserve"> </w:t>
-      </w:r>
-      <w:r>
+        <w:rPr>
+          <w:rFonts w:cs="Times New Roman"/>
+        </w:rPr>
+        <w:t xml:space="preserve"> and </w:t>
+      </w:r>
+      <w:proofErr w:type="spellStart"/>
+      <w:r>
+        <w:rPr>
+          <w:rFonts w:cs="Times New Roman"/>
+        </w:rPr>
+        <w:t>user_id</w:t>
+      </w:r>
+      <w:proofErr w:type="spellEnd"/>
+      <w:r>
+        <w:rPr>
+          <w:rFonts w:cs="Times New Roman"/>
+        </w:rPr>
+        <w:t xml:space="preserve"> are foreign keys that connect with the user who </w:t>
+      </w:r>
+      <w:r>
+        <w:rPr>
+          <w:rFonts w:cs="Times New Roman"/>
+        </w:rPr>
+        <w:t xml:space="preserve">writes the </w:t>
+      </w:r>
+      <w:r>
+        <w:rPr>
+          <w:rFonts w:cs="Times New Roman"/>
+        </w:rPr>
+        <w:t xml:space="preserve">review </w:t>
+      </w:r>
+      <w:r>
+        <w:rPr>
+          <w:rFonts w:cs="Times New Roman"/>
+        </w:rPr>
+        <w:t xml:space="preserve">of </w:t>
+      </w:r>
+      <w:r>
+        <w:rPr>
+          <w:rFonts w:cs="Times New Roman"/>
+        </w:rPr>
+        <w:t>this product.</w:t>
+      </w:r>
+      <w:r>
+        <w:rPr>
+          <w:rFonts w:cs="Times New Roman"/>
+        </w:rPr>
+        <w:t xml:space="preserve"> The table also stores </w:t>
+      </w:r>
+      <w:r>
+        <w:rPr>
+          <w:rFonts w:cs="Times New Roman"/>
+        </w:rPr>
         <w:t xml:space="preserve">the </w:t>
       </w:r>
       <w:r>
-        <w:t>primary key, representing each review of products.</w:t>
-      </w:r>
-      <w:r>
-        <w:t xml:space="preserve"> </w:t>
-      </w:r>
-      <w:proofErr w:type="spellStart"/>
-      <w:r>
-        <w:t>Product_id</w:t>
-      </w:r>
-      <w:proofErr w:type="spellEnd"/>
-      <w:r>
-        <w:t xml:space="preserve"> and </w:t>
-      </w:r>
-      <w:proofErr w:type="spellStart"/>
-      <w:r>
-        <w:t>user_id</w:t>
-      </w:r>
-      <w:proofErr w:type="spellEnd"/>
-      <w:r>
-        <w:t xml:space="preserve"> are foreign keys that connect with the user who </w:t>
-      </w:r>
-      <w:r>
-        <w:t xml:space="preserve">writes the </w:t>
-      </w:r>
-      <w:r>
-        <w:t xml:space="preserve">review </w:t>
-      </w:r>
-      <w:r>
-        <w:t xml:space="preserve">of </w:t>
-      </w:r>
-      <w:r>
-        <w:t>this product.</w:t>
-      </w:r>
-      <w:r>
-        <w:t xml:space="preserve"> The table also stores </w:t>
-      </w:r>
-      <w:r>
-        <w:t xml:space="preserve">the </w:t>
-      </w:r>
-      <w:r>
+        <w:rPr>
+          <w:rFonts w:cs="Times New Roman"/>
+        </w:rPr>
         <w:t xml:space="preserve">rating, </w:t>
       </w:r>
       <w:r>
+        <w:rPr>
+          <w:rFonts w:cs="Times New Roman"/>
+        </w:rPr>
         <w:t>r</w:t>
       </w:r>
       <w:r>
+        <w:rPr>
+          <w:rFonts w:cs="Times New Roman"/>
+        </w:rPr>
         <w:t>eview title</w:t>
       </w:r>
       <w:r>
+        <w:rPr>
+          <w:rFonts w:cs="Times New Roman"/>
+        </w:rPr>
         <w:t xml:space="preserve">, </w:t>
       </w:r>
       <w:r>
+        <w:rPr>
+          <w:rFonts w:cs="Times New Roman"/>
+        </w:rPr>
         <w:t>content</w:t>
       </w:r>
       <w:r>
+        <w:rPr>
+          <w:rFonts w:cs="Times New Roman"/>
+        </w:rPr>
         <w:t xml:space="preserve"> and review date</w:t>
       </w:r>
       <w:r>
+        <w:rPr>
+          <w:rFonts w:cs="Times New Roman"/>
+        </w:rPr>
         <w:t>.</w:t>
       </w:r>
     </w:p>
     <w:p>
-      <w:r>
-        <w:rPr>
+      <w:pPr>
+        <w:rPr>
+          <w:rFonts w:cs="Times New Roman"/>
+        </w:rPr>
+      </w:pPr>
+      <w:r>
+        <w:rPr>
+          <w:rFonts w:cs="Times New Roman"/>
           <w:noProof/>
         </w:rPr>
         <w:drawing>
@@ -637,7 +1315,7 @@
                     <pic:cNvPicPr/>
                   </pic:nvPicPr>
                   <pic:blipFill>
-                    <a:blip r:embed="rId10"/>
+                    <a:blip r:embed="rId12"/>
                     <a:stretch>
                       <a:fillRect/>
                     </a:stretch>
@@ -659,63 +1337,101 @@
       </w:r>
     </w:p>
     <w:p>
-      <w:r>
+      <w:pPr>
+        <w:rPr>
+          <w:rFonts w:cs="Times New Roman"/>
+        </w:rPr>
+      </w:pPr>
+      <w:r>
+        <w:rPr>
+          <w:rFonts w:cs="Times New Roman"/>
+        </w:rPr>
         <w:t xml:space="preserve">The </w:t>
       </w:r>
       <w:proofErr w:type="spellStart"/>
       <w:r>
+        <w:rPr>
+          <w:rFonts w:cs="Times New Roman"/>
+        </w:rPr>
         <w:t>review_votes</w:t>
       </w:r>
       <w:proofErr w:type="spellEnd"/>
       <w:r>
-        <w:t xml:space="preserve"> table</w:t>
-      </w:r>
-      <w:r>
-        <w:t xml:space="preserve"> capture</w:t>
-      </w:r>
-      <w:r>
-        <w:t xml:space="preserve">s users’ </w:t>
-      </w:r>
-      <w:r>
-        <w:t>feedback on review usefulness.</w:t>
-      </w:r>
-      <w:r>
+        <w:rPr>
+          <w:rFonts w:cs="Times New Roman"/>
+        </w:rPr>
+        <w:t xml:space="preserve"> table captures users’ feedback on review usefulness.</w:t>
+      </w:r>
+      <w:r>
+        <w:rPr>
+          <w:rFonts w:cs="Times New Roman"/>
+        </w:rPr>
         <w:t xml:space="preserve"> </w:t>
       </w:r>
       <w:proofErr w:type="spellStart"/>
       <w:r>
+        <w:rPr>
+          <w:rFonts w:cs="Times New Roman"/>
+        </w:rPr>
         <w:t>Vote_id</w:t>
       </w:r>
       <w:proofErr w:type="spellEnd"/>
       <w:r>
+        <w:rPr>
+          <w:rFonts w:cs="Times New Roman"/>
+        </w:rPr>
         <w:t xml:space="preserve"> is the primary key to represent each vote.</w:t>
       </w:r>
       <w:r>
+        <w:rPr>
+          <w:rFonts w:cs="Times New Roman"/>
+        </w:rPr>
         <w:t xml:space="preserve"> </w:t>
       </w:r>
       <w:proofErr w:type="spellStart"/>
       <w:r>
+        <w:rPr>
+          <w:rFonts w:cs="Times New Roman"/>
+        </w:rPr>
         <w:t>Review_id</w:t>
       </w:r>
       <w:proofErr w:type="spellEnd"/>
       <w:r>
+        <w:rPr>
+          <w:rFonts w:cs="Times New Roman"/>
+        </w:rPr>
         <w:t xml:space="preserve"> and </w:t>
       </w:r>
       <w:proofErr w:type="spellStart"/>
       <w:r>
+        <w:rPr>
+          <w:rFonts w:cs="Times New Roman"/>
+        </w:rPr>
         <w:t>User_id</w:t>
       </w:r>
       <w:proofErr w:type="spellEnd"/>
       <w:r>
+        <w:rPr>
+          <w:rFonts w:cs="Times New Roman"/>
+        </w:rPr>
         <w:t xml:space="preserve"> are foreign key that connect with the user who votes for the specific review.</w:t>
       </w:r>
       <w:r>
+        <w:rPr>
+          <w:rFonts w:cs="Times New Roman"/>
+        </w:rPr>
         <w:t xml:space="preserve"> </w:t>
       </w:r>
     </w:p>
     <w:p>
-      <w:r>
-        <w:rPr>
+      <w:pPr>
+        <w:rPr>
+          <w:rFonts w:cs="Times New Roman"/>
+        </w:rPr>
+      </w:pPr>
+      <w:r>
+        <w:rPr>
+          <w:rFonts w:cs="Times New Roman"/>
           <w:noProof/>
         </w:rPr>
         <w:drawing>
@@ -734,7 +1450,7 @@
                     <pic:cNvPicPr/>
                   </pic:nvPicPr>
                   <pic:blipFill>
-                    <a:blip r:embed="rId11"/>
+                    <a:blip r:embed="rId13"/>
                     <a:stretch>
                       <a:fillRect/>
                     </a:stretch>
@@ -756,55 +1472,105 @@
       </w:r>
     </w:p>
     <w:p>
-      <w:r>
+      <w:pPr>
+        <w:rPr>
+          <w:rFonts w:cs="Times New Roman"/>
+        </w:rPr>
+      </w:pPr>
+      <w:r>
+        <w:rPr>
+          <w:rFonts w:cs="Times New Roman"/>
+        </w:rPr>
         <w:t xml:space="preserve">When the reviews include an image, the </w:t>
       </w:r>
       <w:proofErr w:type="spellStart"/>
       <w:r>
+        <w:rPr>
+          <w:rFonts w:cs="Times New Roman"/>
+        </w:rPr>
         <w:t>review_images</w:t>
       </w:r>
       <w:proofErr w:type="spellEnd"/>
       <w:r>
+        <w:rPr>
+          <w:rFonts w:cs="Times New Roman"/>
+        </w:rPr>
         <w:t xml:space="preserve"> table records the images’ URL link and </w:t>
       </w:r>
       <w:r>
+        <w:rPr>
+          <w:rFonts w:cs="Times New Roman"/>
+        </w:rPr>
         <w:t xml:space="preserve">the </w:t>
       </w:r>
       <w:r>
+        <w:rPr>
+          <w:rFonts w:cs="Times New Roman"/>
+        </w:rPr>
         <w:t xml:space="preserve">uploaded date. </w:t>
       </w:r>
       <w:proofErr w:type="spellStart"/>
       <w:r>
+        <w:rPr>
+          <w:rFonts w:cs="Times New Roman"/>
+        </w:rPr>
         <w:t>Image_id</w:t>
       </w:r>
       <w:proofErr w:type="spellEnd"/>
       <w:r>
+        <w:rPr>
+          <w:rFonts w:cs="Times New Roman"/>
+        </w:rPr>
         <w:t xml:space="preserve"> is the primary key and </w:t>
       </w:r>
       <w:proofErr w:type="spellStart"/>
       <w:r>
+        <w:rPr>
+          <w:rFonts w:cs="Times New Roman"/>
+        </w:rPr>
         <w:t>review_id</w:t>
       </w:r>
       <w:proofErr w:type="spellEnd"/>
       <w:r>
+        <w:rPr>
+          <w:rFonts w:cs="Times New Roman"/>
+        </w:rPr>
         <w:t xml:space="preserve"> is the fore</w:t>
       </w:r>
       <w:r>
+        <w:rPr>
+          <w:rFonts w:cs="Times New Roman"/>
+        </w:rPr>
         <w:t>ig</w:t>
       </w:r>
       <w:r>
+        <w:rPr>
+          <w:rFonts w:cs="Times New Roman"/>
+        </w:rPr>
         <w:t xml:space="preserve">n key that connects to </w:t>
       </w:r>
       <w:r>
+        <w:rPr>
+          <w:rFonts w:cs="Times New Roman"/>
+        </w:rPr>
         <w:t xml:space="preserve">the </w:t>
       </w:r>
       <w:r>
+        <w:rPr>
+          <w:rFonts w:cs="Times New Roman"/>
+        </w:rPr>
         <w:t>reviews table.</w:t>
       </w:r>
     </w:p>
     <w:p>
-      <w:r>
-        <w:rPr>
+      <w:pPr>
+        <w:rPr>
+          <w:rFonts w:cs="Times New Roman"/>
+        </w:rPr>
+      </w:pPr>
+      <w:r>
+        <w:rPr>
+          <w:rFonts w:cs="Times New Roman"/>
           <w:noProof/>
         </w:rPr>
         <w:drawing>
@@ -823,7 +1589,7 @@
                     <pic:cNvPicPr/>
                   </pic:nvPicPr>
                   <pic:blipFill>
-                    <a:blip r:embed="rId12"/>
+                    <a:blip r:embed="rId14"/>
                     <a:stretch>
                       <a:fillRect/>
                     </a:stretch>
@@ -844,29 +1610,77 @@
         </w:drawing>
       </w:r>
     </w:p>
-    <w:p/>
-    <w:p>
-      <w:r>
+    <w:p>
+      <w:pPr>
+        <w:rPr>
+          <w:rFonts w:cs="Times New Roman"/>
+        </w:rPr>
+      </w:pPr>
+    </w:p>
+    <w:p>
+      <w:pPr>
+        <w:rPr>
+          <w:rFonts w:cs="Times New Roman"/>
+          <w:b/>
+          <w:bCs/>
+        </w:rPr>
+      </w:pPr>
+      <w:r>
+        <w:rPr>
+          <w:rFonts w:cs="Times New Roman"/>
+          <w:b/>
+          <w:bCs/>
+        </w:rPr>
         <w:lastRenderedPageBreak/>
+        <w:t xml:space="preserve">Database </w:t>
+      </w:r>
+      <w:r>
+        <w:rPr>
+          <w:rFonts w:cs="Times New Roman"/>
+          <w:b/>
+          <w:bCs/>
+        </w:rPr>
         <w:t>Design</w:t>
       </w:r>
       <w:r>
+        <w:rPr>
+          <w:rFonts w:cs="Times New Roman"/>
+          <w:b/>
+          <w:bCs/>
+        </w:rPr>
         <w:t xml:space="preserve"> </w:t>
       </w:r>
     </w:p>
     <w:p>
-      <w:r>
+      <w:pPr>
+        <w:rPr>
+          <w:rFonts w:cs="Times New Roman"/>
+        </w:rPr>
+      </w:pPr>
+      <w:r>
+        <w:rPr>
+          <w:rFonts w:cs="Times New Roman"/>
+        </w:rPr>
         <w:t>All tables in my database are normalized to Third Normal Form (3NF</w:t>
       </w:r>
       <w:proofErr w:type="gramStart"/>
       <w:r>
+        <w:rPr>
+          <w:rFonts w:cs="Times New Roman"/>
+        </w:rPr>
         <w:t>)</w:t>
       </w:r>
       <w:proofErr w:type="gramEnd"/>
       <w:r>
+        <w:rPr>
+          <w:rFonts w:cs="Times New Roman"/>
+        </w:rPr>
         <w:t xml:space="preserve"> so the data stays organized. I used normalization to make the database easier to manage.</w:t>
       </w:r>
       <w:r>
+        <w:rPr>
+          <w:rFonts w:cs="Times New Roman"/>
+        </w:rPr>
         <w:t xml:space="preserve"> </w:t>
       </w:r>
     </w:p>
@@ -877,8 +1691,14 @@
           <w:ilvl w:val="0"/>
           <w:numId w:val="2"/>
         </w:numPr>
-      </w:pPr>
-      <w:r>
+        <w:rPr>
+          <w:rFonts w:cs="Times New Roman"/>
+        </w:rPr>
+      </w:pPr>
+      <w:r>
+        <w:rPr>
+          <w:rFonts w:cs="Times New Roman"/>
+        </w:rPr>
         <w:t>In First Normal Form (1NF), each cell in the table contains only one value, and there are no repeating groups. Each row is unique, and each column contains one type of data only.</w:t>
       </w:r>
     </w:p>
@@ -889,8 +1709,14 @@
           <w:ilvl w:val="0"/>
           <w:numId w:val="2"/>
         </w:numPr>
-      </w:pPr>
-      <w:r>
+        <w:rPr>
+          <w:rFonts w:cs="Times New Roman"/>
+        </w:rPr>
+      </w:pPr>
+      <w:r>
+        <w:rPr>
+          <w:rFonts w:cs="Times New Roman"/>
+        </w:rPr>
         <w:t>In Second Normal Form (2NF), each table has a primary key, and all the non-key columns depend on the whole primary key. Because of this, there are no partial dependencies in the database.</w:t>
       </w:r>
     </w:p>
@@ -901,93 +1727,196 @@
           <w:ilvl w:val="0"/>
           <w:numId w:val="2"/>
         </w:numPr>
-      </w:pPr>
-      <w:r>
+        <w:rPr>
+          <w:rFonts w:cs="Times New Roman"/>
+        </w:rPr>
+      </w:pPr>
+      <w:r>
+        <w:rPr>
+          <w:rFonts w:cs="Times New Roman"/>
+        </w:rPr>
         <w:t>In Third Normal Form (3NF), the non-key attributes depend only on the primary key and not on other non-key attributes. This means there are no transitive dependencies. Each table in my design focuses on one main type of information, and the relationships between tables are connected using primary keys and foreign keys.</w:t>
       </w:r>
     </w:p>
     <w:p>
-      <w:r>
+      <w:pPr>
+        <w:rPr>
+          <w:rFonts w:cs="Times New Roman"/>
+        </w:rPr>
+      </w:pPr>
+      <w:r>
+        <w:rPr>
+          <w:rFonts w:cs="Times New Roman"/>
+        </w:rPr>
         <w:t xml:space="preserve">Brands and categories tables are stored in separate tables instead of </w:t>
       </w:r>
       <w:r>
+        <w:rPr>
+          <w:rFonts w:cs="Times New Roman"/>
+        </w:rPr>
         <w:t>being stacked</w:t>
       </w:r>
       <w:r>
+        <w:rPr>
+          <w:rFonts w:cs="Times New Roman"/>
+        </w:rPr>
         <w:t xml:space="preserve"> directly into the products tabl</w:t>
       </w:r>
       <w:r>
+        <w:rPr>
+          <w:rFonts w:cs="Times New Roman"/>
+        </w:rPr>
         <w:t>e</w:t>
       </w:r>
       <w:r>
+        <w:rPr>
+          <w:rFonts w:cs="Times New Roman"/>
+        </w:rPr>
         <w:t xml:space="preserve">. I did this to avoid repeating the same brand name or category name for </w:t>
       </w:r>
       <w:r>
+        <w:rPr>
+          <w:rFonts w:cs="Times New Roman"/>
+        </w:rPr>
         <w:t>different</w:t>
       </w:r>
       <w:r>
+        <w:rPr>
+          <w:rFonts w:cs="Times New Roman"/>
+        </w:rPr>
         <w:t xml:space="preserve"> products. If multiple products belong to Apple or are in the same category, that information only needs to be stored once, which makes the design cleaner and easier to update.</w:t>
       </w:r>
     </w:p>
     <w:p>
-      <w:r>
+      <w:pPr>
+        <w:rPr>
+          <w:rFonts w:cs="Times New Roman"/>
+        </w:rPr>
+      </w:pPr>
+      <w:r>
+        <w:rPr>
+          <w:rFonts w:cs="Times New Roman"/>
+        </w:rPr>
         <w:t>I also kept review votes in a separate table from reviews because they represent a different kind of data. One review can receive many votes from different users, so putting vote information inside the review table would not make sense. Keeping it separate makes the structure more organized and matches how a real system would work.</w:t>
       </w:r>
     </w:p>
     <w:p>
-      <w:r>
+      <w:pPr>
+        <w:rPr>
+          <w:rFonts w:cs="Times New Roman"/>
+        </w:rPr>
+      </w:pPr>
+      <w:r>
+        <w:rPr>
+          <w:rFonts w:cs="Times New Roman"/>
+        </w:rPr>
         <w:t xml:space="preserve">I added unique constraints to make sure the data follows important rules. For example, usernames and emails should be unique so each user account is different. I also used unique constraints to make sure one user cannot review the same product more than once, and one user </w:t>
       </w:r>
       <w:r>
+        <w:rPr>
+          <w:rFonts w:cs="Times New Roman"/>
+        </w:rPr>
         <w:lastRenderedPageBreak/>
         <w:t>cannot vote on the same review multiple times. These constraints help keep the data accurate and make the database work more like a real product review platform such as Amazon.</w:t>
       </w:r>
     </w:p>
-    <w:p/>
-    <w:p>
-      <w:r>
+    <w:p>
+      <w:pPr>
+        <w:rPr>
+          <w:rFonts w:cs="Times New Roman"/>
+          <w:b/>
+          <w:bCs/>
+        </w:rPr>
+      </w:pPr>
+      <w:r>
+        <w:rPr>
+          <w:rFonts w:cs="Times New Roman"/>
+          <w:b/>
+          <w:bCs/>
+        </w:rPr>
         <w:t>Analysis</w:t>
       </w:r>
     </w:p>
     <w:p>
-      <w:r>
+      <w:pPr>
+        <w:rPr>
+          <w:rFonts w:cs="Times New Roman"/>
+        </w:rPr>
+      </w:pPr>
+      <w:r>
+        <w:rPr>
+          <w:rFonts w:cs="Times New Roman"/>
+        </w:rPr>
         <w:t xml:space="preserve">When we </w:t>
       </w:r>
       <w:r>
+        <w:rPr>
+          <w:rFonts w:cs="Times New Roman"/>
+        </w:rPr>
         <w:t xml:space="preserve">left </w:t>
       </w:r>
       <w:r>
+        <w:rPr>
+          <w:rFonts w:cs="Times New Roman"/>
+        </w:rPr>
         <w:t xml:space="preserve">join the products table with the reviews table, and group by </w:t>
       </w:r>
       <w:proofErr w:type="spellStart"/>
       <w:r>
+        <w:rPr>
+          <w:rFonts w:cs="Times New Roman"/>
+        </w:rPr>
         <w:t>product_id</w:t>
       </w:r>
       <w:proofErr w:type="spellEnd"/>
       <w:r>
+        <w:rPr>
+          <w:rFonts w:cs="Times New Roman"/>
+        </w:rPr>
         <w:t xml:space="preserve"> and </w:t>
       </w:r>
       <w:proofErr w:type="spellStart"/>
       <w:r>
+        <w:rPr>
+          <w:rFonts w:cs="Times New Roman"/>
+        </w:rPr>
         <w:t>product_name</w:t>
       </w:r>
       <w:proofErr w:type="spellEnd"/>
       <w:r>
+        <w:rPr>
+          <w:rFonts w:cs="Times New Roman"/>
+        </w:rPr>
         <w:t>, we can calculate the average rating per product based on the review</w:t>
       </w:r>
       <w:r>
+        <w:rPr>
+          <w:rFonts w:cs="Times New Roman"/>
+        </w:rPr>
         <w:t>s</w:t>
       </w:r>
       <w:r>
+        <w:rPr>
+          <w:rFonts w:cs="Times New Roman"/>
+        </w:rPr>
         <w:t>.</w:t>
       </w:r>
       <w:r>
+        <w:rPr>
+          <w:rFonts w:cs="Times New Roman"/>
+        </w:rPr>
         <w:t xml:space="preserve"> From the screenshot, we can see product WH-1000XM5 has the highest rating based on 1 review.</w:t>
       </w:r>
     </w:p>
     <w:p>
-      <w:r>
-        <w:rPr>
+      <w:pPr>
+        <w:rPr>
+          <w:rFonts w:cs="Times New Roman"/>
+        </w:rPr>
+      </w:pPr>
+      <w:r>
+        <w:rPr>
+          <w:rFonts w:cs="Times New Roman"/>
           <w:noProof/>
         </w:rPr>
         <w:drawing>
@@ -1006,7 +1935,7 @@
                     <pic:cNvPicPr/>
                   </pic:nvPicPr>
                   <pic:blipFill>
-                    <a:blip r:embed="rId13"/>
+                    <a:blip r:embed="rId15"/>
                     <a:stretch>
                       <a:fillRect/>
                     </a:stretch>
@@ -1028,41 +1957,76 @@
       </w:r>
     </w:p>
     <w:p>
-      <w:r>
+      <w:pPr>
+        <w:rPr>
+          <w:rFonts w:cs="Times New Roman"/>
+        </w:rPr>
+      </w:pPr>
+      <w:r>
+        <w:rPr>
+          <w:rFonts w:cs="Times New Roman"/>
+        </w:rPr>
         <w:t xml:space="preserve">If we want to get all the reviews with </w:t>
       </w:r>
       <w:r>
+        <w:rPr>
+          <w:rFonts w:cs="Times New Roman"/>
+        </w:rPr>
         <w:t xml:space="preserve">their </w:t>
       </w:r>
       <w:r>
+        <w:rPr>
+          <w:rFonts w:cs="Times New Roman"/>
+        </w:rPr>
         <w:t xml:space="preserve">correlated </w:t>
       </w:r>
       <w:r>
+        <w:rPr>
+          <w:rFonts w:cs="Times New Roman"/>
+        </w:rPr>
         <w:t>user and product, we can use inner join</w:t>
       </w:r>
       <w:r>
+        <w:rPr>
+          <w:rFonts w:cs="Times New Roman"/>
+        </w:rPr>
         <w:t>s on the</w:t>
       </w:r>
       <w:r>
+        <w:rPr>
+          <w:rFonts w:cs="Times New Roman"/>
+        </w:rPr>
         <w:t xml:space="preserve"> </w:t>
       </w:r>
       <w:r>
+        <w:rPr>
+          <w:rFonts w:cs="Times New Roman"/>
+        </w:rPr>
         <w:t>reviews table, the users table and the products table.</w:t>
       </w:r>
       <w:r>
+        <w:rPr>
+          <w:rFonts w:cs="Times New Roman"/>
+        </w:rPr>
         <w:t xml:space="preserve"> </w:t>
       </w:r>
     </w:p>
     <w:p>
-      <w:r>
-        <w:rPr>
+      <w:pPr>
+        <w:rPr>
+          <w:rFonts w:cs="Times New Roman"/>
+        </w:rPr>
+      </w:pPr>
+      <w:r>
+        <w:rPr>
+          <w:rFonts w:cs="Times New Roman"/>
           <w:noProof/>
         </w:rPr>
         <w:lastRenderedPageBreak/>
         <w:drawing>
-          <wp:inline distT="0" distB="0" distL="0" distR="0" wp14:anchorId="430A0415" wp14:editId="43137C47">
-            <wp:extent cx="5841083" cy="3827282"/>
-            <wp:effectExtent l="0" t="0" r="1270" b="0"/>
+          <wp:inline distT="0" distB="0" distL="0" distR="0" wp14:anchorId="430A0415" wp14:editId="1EA8E4C1">
+            <wp:extent cx="5467024" cy="3582186"/>
+            <wp:effectExtent l="0" t="0" r="0" b="0"/>
             <wp:docPr id="95395263" name="Picture 1"/>
             <wp:cNvGraphicFramePr>
               <a:graphicFrameLocks xmlns:a="http://schemas.openxmlformats.org/drawingml/2006/main" noChangeAspect="1"/>
@@ -1075,7 +2039,7 @@
                     <pic:cNvPicPr/>
                   </pic:nvPicPr>
                   <pic:blipFill>
-                    <a:blip r:embed="rId14"/>
+                    <a:blip r:embed="rId16"/>
                     <a:stretch>
                       <a:fillRect/>
                     </a:stretch>
@@ -1083,7 +2047,7 @@
                   <pic:spPr>
                     <a:xfrm>
                       <a:off x="0" y="0"/>
-                      <a:ext cx="5842311" cy="3828087"/>
+                      <a:ext cx="5486072" cy="3594667"/>
                     </a:xfrm>
                     <a:prstGeom prst="rect">
                       <a:avLst/>
@@ -1097,37 +2061,65 @@
       </w:r>
     </w:p>
     <w:p>
-      <w:r>
+      <w:pPr>
+        <w:rPr>
+          <w:rFonts w:cs="Times New Roman"/>
+        </w:rPr>
+      </w:pPr>
+      <w:r>
+        <w:rPr>
+          <w:rFonts w:cs="Times New Roman"/>
+        </w:rPr>
         <w:t xml:space="preserve">Using reviews table to left join the </w:t>
       </w:r>
       <w:proofErr w:type="spellStart"/>
       <w:r>
+        <w:rPr>
+          <w:rFonts w:cs="Times New Roman"/>
+        </w:rPr>
         <w:t>review_votes</w:t>
       </w:r>
       <w:proofErr w:type="spellEnd"/>
       <w:r>
+        <w:rPr>
+          <w:rFonts w:cs="Times New Roman"/>
+        </w:rPr>
         <w:t xml:space="preserve"> table, we can connect the information and </w:t>
       </w:r>
       <w:r>
+        <w:rPr>
+          <w:rFonts w:cs="Times New Roman"/>
+        </w:rPr>
         <w:t>learn</w:t>
       </w:r>
       <w:r>
+        <w:rPr>
+          <w:rFonts w:cs="Times New Roman"/>
+        </w:rPr>
         <w:t xml:space="preserve"> whether a review is helpful or not through the votes. </w:t>
       </w:r>
       <w:r>
+        <w:rPr>
+          <w:rFonts w:cs="Times New Roman"/>
+        </w:rPr>
         <w:t>From the screenshot, the “Excellent phone” review is helpful to the users.</w:t>
       </w:r>
     </w:p>
     <w:p>
-      <w:r>
-        <w:rPr>
+      <w:pPr>
+        <w:rPr>
+          <w:rFonts w:cs="Times New Roman"/>
+        </w:rPr>
+      </w:pPr>
+      <w:r>
+        <w:rPr>
+          <w:rFonts w:cs="Times New Roman"/>
           <w:noProof/>
         </w:rPr>
-        <w:lastRenderedPageBreak/>
         <w:drawing>
-          <wp:inline distT="0" distB="0" distL="0" distR="0" wp14:anchorId="18CE1966" wp14:editId="32FA736E">
-            <wp:extent cx="5725968" cy="3337089"/>
-            <wp:effectExtent l="0" t="0" r="1905" b="3175"/>
+          <wp:inline distT="0" distB="0" distL="0" distR="0" wp14:anchorId="18CE1966" wp14:editId="10F22068">
+            <wp:extent cx="5466715" cy="3185996"/>
+            <wp:effectExtent l="0" t="0" r="0" b="1905"/>
             <wp:docPr id="1932361686" name="Picture 1"/>
             <wp:cNvGraphicFramePr>
               <a:graphicFrameLocks xmlns:a="http://schemas.openxmlformats.org/drawingml/2006/main" noChangeAspect="1"/>
@@ -1140,7 +2132,7 @@
                     <pic:cNvPicPr/>
                   </pic:nvPicPr>
                   <pic:blipFill>
-                    <a:blip r:embed="rId15"/>
+                    <a:blip r:embed="rId17"/>
                     <a:stretch>
                       <a:fillRect/>
                     </a:stretch>
@@ -1148,7 +2140,7 @@
                   <pic:spPr>
                     <a:xfrm>
                       <a:off x="0" y="0"/>
-                      <a:ext cx="5739469" cy="3344957"/>
+                      <a:ext cx="5512210" cy="3212511"/>
                     </a:xfrm>
                     <a:prstGeom prst="rect">
                       <a:avLst/>
@@ -1162,29 +2154,53 @@
       </w:r>
     </w:p>
     <w:p>
-      <w:r>
+      <w:pPr>
+        <w:rPr>
+          <w:rFonts w:cs="Times New Roman"/>
+        </w:rPr>
+      </w:pPr>
+      <w:r>
+        <w:rPr>
+          <w:rFonts w:cs="Times New Roman"/>
+        </w:rPr>
+        <w:lastRenderedPageBreak/>
         <w:t xml:space="preserve">By inner joining the products table, categories table and reviews table, we can see </w:t>
       </w:r>
       <w:r>
+        <w:rPr>
+          <w:rFonts w:cs="Times New Roman"/>
+        </w:rPr>
         <w:t xml:space="preserve">the average rating for each product and its </w:t>
       </w:r>
       <w:proofErr w:type="spellStart"/>
       <w:r>
+        <w:rPr>
+          <w:rFonts w:cs="Times New Roman"/>
+        </w:rPr>
         <w:t>category_name</w:t>
       </w:r>
       <w:proofErr w:type="spellEnd"/>
       <w:r>
+        <w:rPr>
+          <w:rFonts w:cs="Times New Roman"/>
+        </w:rPr>
         <w:t>.</w:t>
       </w:r>
     </w:p>
     <w:p>
-      <w:r>
-        <w:rPr>
+      <w:pPr>
+        <w:rPr>
+          <w:rFonts w:cs="Times New Roman"/>
+        </w:rPr>
+      </w:pPr>
+      <w:r>
+        <w:rPr>
+          <w:rFonts w:cs="Times New Roman"/>
           <w:noProof/>
         </w:rPr>
         <w:drawing>
-          <wp:inline distT="0" distB="0" distL="0" distR="0" wp14:anchorId="3F9FEA7E" wp14:editId="0A1CFF33">
-            <wp:extent cx="5022015" cy="3723588"/>
+          <wp:inline distT="0" distB="0" distL="0" distR="0" wp14:anchorId="3F9FEA7E" wp14:editId="634B2F81">
+            <wp:extent cx="3928613" cy="2912882"/>
             <wp:effectExtent l="0" t="0" r="0" b="0"/>
             <wp:docPr id="2131718935" name="Picture 1"/>
             <wp:cNvGraphicFramePr>
@@ -1198,7 +2214,7 @@
                     <pic:cNvPicPr/>
                   </pic:nvPicPr>
                   <pic:blipFill>
-                    <a:blip r:embed="rId16"/>
+                    <a:blip r:embed="rId18"/>
                     <a:stretch>
                       <a:fillRect/>
                     </a:stretch>
@@ -1206,7 +2222,7 @@
                   <pic:spPr>
                     <a:xfrm>
                       <a:off x="0" y="0"/>
-                      <a:ext cx="5053074" cy="3746617"/>
+                      <a:ext cx="3994688" cy="2961874"/>
                     </a:xfrm>
                     <a:prstGeom prst="rect">
                       <a:avLst/>
@@ -1220,52 +2236,89 @@
       </w:r>
     </w:p>
     <w:p>
-      <w:r>
-        <w:lastRenderedPageBreak/>
+      <w:pPr>
+        <w:rPr>
+          <w:rFonts w:cs="Times New Roman"/>
+        </w:rPr>
+      </w:pPr>
+      <w:r>
+        <w:rPr>
+          <w:rFonts w:cs="Times New Roman"/>
+        </w:rPr>
         <w:t xml:space="preserve">If we want to check how many reviews each user has written, we can use users table to left join reviews table and count the number of </w:t>
       </w:r>
       <w:proofErr w:type="spellStart"/>
       <w:proofErr w:type="gramStart"/>
       <w:r>
+        <w:rPr>
+          <w:rFonts w:cs="Times New Roman"/>
+        </w:rPr>
         <w:t>review</w:t>
       </w:r>
       <w:proofErr w:type="gramEnd"/>
       <w:r>
+        <w:rPr>
+          <w:rFonts w:cs="Times New Roman"/>
+        </w:rPr>
         <w:t>_id</w:t>
       </w:r>
       <w:proofErr w:type="spellEnd"/>
       <w:r>
+        <w:rPr>
+          <w:rFonts w:cs="Times New Roman"/>
+        </w:rPr>
         <w:t xml:space="preserve">. By ordering the </w:t>
       </w:r>
       <w:proofErr w:type="spellStart"/>
       <w:r>
+        <w:rPr>
+          <w:rFonts w:cs="Times New Roman"/>
+        </w:rPr>
         <w:t>total_reviews</w:t>
       </w:r>
       <w:proofErr w:type="spellEnd"/>
       <w:r>
+        <w:rPr>
+          <w:rFonts w:cs="Times New Roman"/>
+        </w:rPr>
         <w:t>, we can check each user with its number of reviews in descending order.</w:t>
       </w:r>
       <w:r>
+        <w:rPr>
+          <w:rFonts w:cs="Times New Roman"/>
+        </w:rPr>
         <w:t xml:space="preserve"> In the screenshot, we can see “bob02” has </w:t>
       </w:r>
       <w:proofErr w:type="gramStart"/>
       <w:r>
+        <w:rPr>
+          <w:rFonts w:cs="Times New Roman"/>
+        </w:rPr>
         <w:t>the most</w:t>
       </w:r>
       <w:proofErr w:type="gramEnd"/>
       <w:r>
+        <w:rPr>
+          <w:rFonts w:cs="Times New Roman"/>
+        </w:rPr>
         <w:t xml:space="preserve"> number of reviews.</w:t>
       </w:r>
     </w:p>
     <w:p>
-      <w:r>
-        <w:rPr>
+      <w:pPr>
+        <w:rPr>
+          <w:rFonts w:cs="Times New Roman"/>
+        </w:rPr>
+      </w:pPr>
+      <w:r>
+        <w:rPr>
+          <w:rFonts w:cs="Times New Roman"/>
           <w:noProof/>
         </w:rPr>
         <w:drawing>
-          <wp:inline distT="0" distB="0" distL="0" distR="0" wp14:anchorId="30E009D5" wp14:editId="1DE5FEFB">
-            <wp:extent cx="5689600" cy="4292600"/>
-            <wp:effectExtent l="0" t="0" r="0" b="0"/>
+          <wp:inline distT="0" distB="0" distL="0" distR="0" wp14:anchorId="30E009D5" wp14:editId="292F14C7">
+            <wp:extent cx="3996965" cy="3015566"/>
+            <wp:effectExtent l="0" t="0" r="3810" b="0"/>
             <wp:docPr id="1823116164" name="Picture 1"/>
             <wp:cNvGraphicFramePr>
               <a:graphicFrameLocks xmlns:a="http://schemas.openxmlformats.org/drawingml/2006/main" noChangeAspect="1"/>
@@ -1278,7 +2331,7 @@
                     <pic:cNvPicPr/>
                   </pic:nvPicPr>
                   <pic:blipFill>
-                    <a:blip r:embed="rId17"/>
+                    <a:blip r:embed="rId19"/>
                     <a:stretch>
                       <a:fillRect/>
                     </a:stretch>
@@ -1286,7 +2339,7 @@
                   <pic:spPr>
                     <a:xfrm>
                       <a:off x="0" y="0"/>
-                      <a:ext cx="5689600" cy="4292600"/>
+                      <a:ext cx="4058203" cy="3061768"/>
                     </a:xfrm>
                     <a:prstGeom prst="rect">
                       <a:avLst/>
@@ -1300,31 +2353,57 @@
       </w:r>
     </w:p>
     <w:p>
-      <w:r>
+      <w:pPr>
+        <w:rPr>
+          <w:rFonts w:cs="Times New Roman"/>
+        </w:rPr>
+      </w:pPr>
+      <w:r>
+        <w:rPr>
+          <w:rFonts w:cs="Times New Roman"/>
+        </w:rPr>
+        <w:lastRenderedPageBreak/>
         <w:t>We can also check whether any products have not received any reviews</w:t>
       </w:r>
       <w:r>
+        <w:rPr>
+          <w:rFonts w:cs="Times New Roman"/>
+        </w:rPr>
         <w:t xml:space="preserve"> by joining products table with reviews table</w:t>
       </w:r>
       <w:r>
+        <w:rPr>
+          <w:rFonts w:cs="Times New Roman"/>
+        </w:rPr>
         <w:t xml:space="preserve">. Based on the screenshot, no rows </w:t>
       </w:r>
       <w:r>
+        <w:rPr>
+          <w:rFonts w:cs="Times New Roman"/>
+        </w:rPr>
         <w:t>are</w:t>
       </w:r>
       <w:r>
+        <w:rPr>
+          <w:rFonts w:cs="Times New Roman"/>
+        </w:rPr>
         <w:t xml:space="preserve"> returned, which means every product has at least one review.</w:t>
       </w:r>
     </w:p>
     <w:p>
-      <w:r>
-        <w:rPr>
+      <w:pPr>
+        <w:rPr>
+          <w:rFonts w:cs="Times New Roman"/>
+        </w:rPr>
+      </w:pPr>
+      <w:r>
+        <w:rPr>
+          <w:rFonts w:cs="Times New Roman"/>
           <w:noProof/>
         </w:rPr>
-        <w:lastRenderedPageBreak/>
         <w:drawing>
-          <wp:inline distT="0" distB="0" distL="0" distR="0" wp14:anchorId="33F46228" wp14:editId="4166694E">
-            <wp:extent cx="5727700" cy="4127500"/>
+          <wp:inline distT="0" distB="0" distL="0" distR="0" wp14:anchorId="33F46228" wp14:editId="0F7835EF">
+            <wp:extent cx="4270342" cy="3077297"/>
             <wp:effectExtent l="0" t="0" r="0" b="0"/>
             <wp:docPr id="350037781" name="Picture 1"/>
             <wp:cNvGraphicFramePr>
@@ -1338,7 +2417,7 @@
                     <pic:cNvPicPr/>
                   </pic:nvPicPr>
                   <pic:blipFill>
-                    <a:blip r:embed="rId18"/>
+                    <a:blip r:embed="rId20"/>
                     <a:stretch>
                       <a:fillRect/>
                     </a:stretch>
@@ -1346,7 +2425,7 @@
                   <pic:spPr>
                     <a:xfrm>
                       <a:off x="0" y="0"/>
-                      <a:ext cx="5727700" cy="4127500"/>
+                      <a:ext cx="4302682" cy="3100602"/>
                     </a:xfrm>
                     <a:prstGeom prst="rect">
                       <a:avLst/>
@@ -1360,37 +2439,65 @@
       </w:r>
     </w:p>
     <w:p>
-      <w:r>
+      <w:pPr>
+        <w:rPr>
+          <w:rFonts w:cs="Times New Roman"/>
+        </w:rPr>
+      </w:pPr>
+      <w:r>
+        <w:rPr>
+          <w:rFonts w:cs="Times New Roman"/>
+        </w:rPr>
         <w:t xml:space="preserve">By </w:t>
       </w:r>
       <w:r>
+        <w:rPr>
+          <w:rFonts w:cs="Times New Roman"/>
+        </w:rPr>
         <w:t xml:space="preserve">inner </w:t>
       </w:r>
       <w:r>
+        <w:rPr>
+          <w:rFonts w:cs="Times New Roman"/>
+        </w:rPr>
         <w:t xml:space="preserve">joining reviews table and </w:t>
       </w:r>
       <w:proofErr w:type="spellStart"/>
       <w:r>
+        <w:rPr>
+          <w:rFonts w:cs="Times New Roman"/>
+        </w:rPr>
         <w:t>review_images</w:t>
       </w:r>
       <w:proofErr w:type="spellEnd"/>
       <w:r>
+        <w:rPr>
+          <w:rFonts w:cs="Times New Roman"/>
+        </w:rPr>
         <w:t xml:space="preserve"> table, we can see which reviews have images</w:t>
       </w:r>
       <w:r>
+        <w:rPr>
+          <w:rFonts w:cs="Times New Roman"/>
+        </w:rPr>
         <w:t>.</w:t>
       </w:r>
     </w:p>
     <w:p>
-      <w:r>
-        <w:rPr>
+      <w:pPr>
+        <w:rPr>
+          <w:rFonts w:cs="Times New Roman"/>
+        </w:rPr>
+      </w:pPr>
+      <w:r>
+        <w:rPr>
+          <w:rFonts w:cs="Times New Roman"/>
           <w:noProof/>
         </w:rPr>
-        <w:lastRenderedPageBreak/>
         <w:drawing>
-          <wp:inline distT="0" distB="0" distL="0" distR="0" wp14:anchorId="51B08ADC" wp14:editId="5CD62B4E">
-            <wp:extent cx="5943600" cy="3622040"/>
-            <wp:effectExtent l="0" t="0" r="0" b="0"/>
+          <wp:inline distT="0" distB="0" distL="0" distR="0" wp14:anchorId="51B08ADC" wp14:editId="5AF14F2B">
+            <wp:extent cx="5429601" cy="3308808"/>
+            <wp:effectExtent l="0" t="0" r="0" b="6350"/>
             <wp:docPr id="152045241" name="Picture 1"/>
             <wp:cNvGraphicFramePr>
               <a:graphicFrameLocks xmlns:a="http://schemas.openxmlformats.org/drawingml/2006/main" noChangeAspect="1"/>
@@ -1403,7 +2510,7 @@
                     <pic:cNvPicPr/>
                   </pic:nvPicPr>
                   <pic:blipFill>
-                    <a:blip r:embed="rId19"/>
+                    <a:blip r:embed="rId21"/>
                     <a:stretch>
                       <a:fillRect/>
                     </a:stretch>
@@ -1411,7 +2518,7 @@
                   <pic:spPr>
                     <a:xfrm>
                       <a:off x="0" y="0"/>
-                      <a:ext cx="5943600" cy="3622040"/>
+                      <a:ext cx="5444086" cy="3317635"/>
                     </a:xfrm>
                     <a:prstGeom prst="rect">
                       <a:avLst/>
@@ -1425,36 +2532,62 @@
       </w:r>
     </w:p>
     <w:p>
-      <w:r>
+      <w:pPr>
+        <w:rPr>
+          <w:rFonts w:cs="Times New Roman"/>
+        </w:rPr>
+      </w:pPr>
+      <w:r>
+        <w:rPr>
+          <w:rFonts w:cs="Times New Roman"/>
+        </w:rPr>
+        <w:lastRenderedPageBreak/>
         <w:t xml:space="preserve">By inner joining </w:t>
       </w:r>
       <w:proofErr w:type="spellStart"/>
       <w:r>
+        <w:rPr>
+          <w:rFonts w:cs="Times New Roman"/>
+        </w:rPr>
         <w:t>review_votes</w:t>
       </w:r>
       <w:proofErr w:type="spellEnd"/>
       <w:r>
+        <w:rPr>
+          <w:rFonts w:cs="Times New Roman"/>
+        </w:rPr>
         <w:t xml:space="preserve"> table and users table, we can check each </w:t>
       </w:r>
       <w:proofErr w:type="gramStart"/>
       <w:r>
+        <w:rPr>
+          <w:rFonts w:cs="Times New Roman"/>
+        </w:rPr>
         <w:t>users</w:t>
       </w:r>
       <w:proofErr w:type="gramEnd"/>
       <w:r>
+        <w:rPr>
+          <w:rFonts w:cs="Times New Roman"/>
+        </w:rPr>
         <w:t xml:space="preserve"> who has voted on reviews.</w:t>
       </w:r>
     </w:p>
     <w:p>
-      <w:r>
-        <w:rPr>
+      <w:pPr>
+        <w:rPr>
+          <w:rFonts w:cs="Times New Roman"/>
+        </w:rPr>
+      </w:pPr>
+      <w:r>
+        <w:rPr>
+          <w:rFonts w:cs="Times New Roman"/>
           <w:noProof/>
         </w:rPr>
-        <w:lastRenderedPageBreak/>
         <w:drawing>
-          <wp:inline distT="0" distB="0" distL="0" distR="0" wp14:anchorId="29E4872A" wp14:editId="3F2224A2">
-            <wp:extent cx="5867400" cy="4191000"/>
-            <wp:effectExtent l="0" t="0" r="0" b="0"/>
+          <wp:inline distT="0" distB="0" distL="0" distR="0" wp14:anchorId="29E4872A" wp14:editId="405F97FF">
+            <wp:extent cx="4962269" cy="3544478"/>
+            <wp:effectExtent l="0" t="0" r="3810" b="0"/>
             <wp:docPr id="1927593427" name="Picture 1"/>
             <wp:cNvGraphicFramePr>
               <a:graphicFrameLocks xmlns:a="http://schemas.openxmlformats.org/drawingml/2006/main" noChangeAspect="1"/>
@@ -1467,7 +2600,7 @@
                     <pic:cNvPicPr/>
                   </pic:nvPicPr>
                   <pic:blipFill>
-                    <a:blip r:embed="rId20"/>
+                    <a:blip r:embed="rId22"/>
                     <a:stretch>
                       <a:fillRect/>
                     </a:stretch>
@@ -1475,7 +2608,7 @@
                   <pic:spPr>
                     <a:xfrm>
                       <a:off x="0" y="0"/>
-                      <a:ext cx="5867400" cy="4191000"/>
+                      <a:ext cx="4984059" cy="3560042"/>
                     </a:xfrm>
                     <a:prstGeom prst="rect">
                       <a:avLst/>
@@ -1488,8 +2621,83 @@
         </w:drawing>
       </w:r>
     </w:p>
-    <w:p/>
+    <w:p>
+      <w:pPr>
+        <w:rPr>
+          <w:rFonts w:cs="Times New Roman"/>
+          <w:b/>
+          <w:bCs/>
+        </w:rPr>
+      </w:pPr>
+      <w:r>
+        <w:rPr>
+          <w:rFonts w:cs="Times New Roman"/>
+          <w:b/>
+          <w:bCs/>
+        </w:rPr>
+        <w:t>Conclusion</w:t>
+      </w:r>
+    </w:p>
+    <w:p>
+      <w:pPr>
+        <w:rPr>
+          <w:rFonts w:cs="Times New Roman"/>
+        </w:rPr>
+      </w:pPr>
+      <w:r>
+        <w:rPr>
+          <w:rFonts w:cs="Times New Roman"/>
+        </w:rPr>
+        <w:t xml:space="preserve">This project shows how </w:t>
+      </w:r>
+      <w:r>
+        <w:rPr>
+          <w:rFonts w:cs="Times New Roman"/>
+        </w:rPr>
+        <w:t>to use</w:t>
+      </w:r>
+      <w:r>
+        <w:rPr>
+          <w:rFonts w:cs="Times New Roman"/>
+        </w:rPr>
+        <w:t xml:space="preserve"> </w:t>
+      </w:r>
+      <w:r>
+        <w:rPr>
+          <w:rFonts w:cs="Times New Roman"/>
+        </w:rPr>
+        <w:t xml:space="preserve">an </w:t>
+      </w:r>
+      <w:r>
+        <w:rPr>
+          <w:rFonts w:cs="Times New Roman"/>
+        </w:rPr>
+        <w:t>Oracle database to support a product review and rating platform. The database was designed to store products, users, reviews, ratings, votes, and review images in a structured and organized way. By using proper table relationships, constraints, and normalization to 3NF, the design helps keep the data accurate and easy to manage.</w:t>
+      </w:r>
+    </w:p>
+    <w:p>
+      <w:pPr>
+        <w:rPr>
+          <w:rFonts w:cs="Times New Roman"/>
+        </w:rPr>
+      </w:pPr>
+      <w:r>
+        <w:rPr>
+          <w:rFonts w:cs="Times New Roman"/>
+        </w:rPr>
+        <w:t>Through this project, I was able to apply database design concepts such as ER modeling, primary keys, foreign keys, normalization, and SQL implementation in a practical way. This project demonstrates how a well-designed database can support real-world business needs and provide a strong foundation for a database-backed application.</w:t>
+      </w:r>
+    </w:p>
+    <w:p>
+      <w:pPr>
+        <w:rPr>
+          <w:rFonts w:cs="Times New Roman"/>
+        </w:rPr>
+      </w:pPr>
+    </w:p>
     <w:sectPr>
+      <w:headerReference w:type="even" r:id="rId23"/>
+      <w:headerReference w:type="default" r:id="rId24"/>
       <w:pgSz w:w="12240" w:h="15840"/>
       <w:pgMar w:top="1440" w:right="1440" w:bottom="1440" w:left="1440" w:header="720" w:footer="720" w:gutter="0"/>
       <w:cols w:space="720"/>
@@ -1497,6 +2705,179 @@
     </w:sectPr>
   </w:body>
 </w:document>
+</file>
+
+<file path=word/endnotes.xml><?xml version="1.0" encoding="utf-8"?>
+<w:endnotes xmlns:wpc="http://schemas.microsoft.com/office/word/2010/wordprocessingCanvas" xmlns:cx="http://schemas.microsoft.com/office/drawing/2014/chartex" xmlns:cx1="http://schemas.microsoft.com/office/drawing/2015/9/8/chartex" xmlns:cx2="http://schemas.microsoft.com/office/drawing/2015/10/21/chartex" xmlns:cx3="http://schemas.microsoft.com/office/drawing/2016/5/9/chartex" xmlns:cx4="http://schemas.microsoft.com/office/drawing/2016/5/10/chartex" xmlns:cx5="http://schemas.microsoft.com/office/drawing/2016/5/11/chartex" xmlns:cx6="http://schemas.microsoft.com/office/drawing/2016/5/12/chartex" xmlns:cx7="http://schemas.microsoft.com/office/drawing/2016/5/13/chartex" xmlns:cx8="http://schemas.microsoft.com/office/drawing/2016/5/14/chartex" xmlns:mc="http://schemas.openxmlformats.org/markup-compatibility/2006" xmlns:aink="http://schemas.microsoft.com/office/drawing/2016/ink" xmlns:am3d="http://schemas.microsoft.com/office/drawing/2017/model3d" xmlns:o="urn:schemas-microsoft-com:office:office" xmlns:oel="http://schemas.microsoft.com/office/2019/extlst" xmlns:r="http://schemas.openxmlformats.org/officeDocument/2006/relationships" xmlns:m="http://schemas.openxmlformats.org/officeDocument/2006/math" xmlns:v="urn:schemas-microsoft-com:vml" xmlns:wp14="http://schemas.microsoft.com/office/word/2010/wordprocessingDrawing" xmlns:wp="http://schemas.openxmlformats.org/drawingml/2006/wordprocessingDrawing" xmlns:w10="urn:schemas-microsoft-com:office:word" xmlns:w="http://schemas.openxmlformats.org/wordprocessingml/2006/main" xmlns:w14="http://schemas.microsoft.com/office/word/2010/wordml" xmlns:w15="http://schemas.microsoft.com/office/word/2012/wordml" xmlns:w16cex="http://schemas.microsoft.com/office/word/2018/wordml/cex" xmlns:w16cid="http://schemas.microsoft.com/office/word/2016/wordml/cid" xmlns:w16="http://schemas.microsoft.com/office/word/2018/wordml" xmlns:w16du="http://schemas.microsoft.com/office/word/2023/wordml/word16du" xmlns:w16sdtdh="http://schemas.microsoft.com/office/word/2020/wordml/sdtdatahash" xmlns:w16sdtfl="http://schemas.microsoft.com/office/word/2024/wordml/sdtformatlock" xmlns:w16se="http://schemas.microsoft.com/office/word/2015/wordml/symex" xmlns:wpg="http://schemas.microsoft.com/office/word/2010/wordprocessingGroup" xmlns:wpi="http://schemas.microsoft.com/office/word/2010/wordprocessingInk" xmlns:wne="http://schemas.microsoft.com/office/word/2006/wordml" xmlns:wps="http://schemas.microsoft.com/office/word/2010/wordprocessingShape" mc:Ignorable="w14 w15 w16se w16cid w16 w16cex w16sdtdh w16sdtfl w16du wp14">
+  <w:endnote w:type="separator" w:id="-1">
+    <w:p>
+      <w:pPr>
+        <w:spacing w:line="240" w:lineRule="auto"/>
+      </w:pPr>
+      <w:r>
+        <w:separator/>
+      </w:r>
+    </w:p>
+  </w:endnote>
+  <w:endnote w:type="continuationSeparator" w:id="0">
+    <w:p>
+      <w:pPr>
+        <w:spacing w:line="240" w:lineRule="auto"/>
+      </w:pPr>
+      <w:r>
+        <w:continuationSeparator/>
+      </w:r>
+    </w:p>
+  </w:endnote>
+</w:endnotes>
+</file>
+
+<file path=word/footnotes.xml><?xml version="1.0" encoding="utf-8"?>
+<w:footnotes xmlns:wpc="http://schemas.microsoft.com/office/word/2010/wordprocessingCanvas" xmlns:cx="http://schemas.microsoft.com/office/drawing/2014/chartex" xmlns:cx1="http://schemas.microsoft.com/office/drawing/2015/9/8/chartex" xmlns:cx2="http://schemas.microsoft.com/office/drawing/2015/10/21/chartex" xmlns:cx3="http://schemas.microsoft.com/office/drawing/2016/5/9/chartex" xmlns:cx4="http://schemas.microsoft.com/office/drawing/2016/5/10/chartex" xmlns:cx5="http://schemas.microsoft.com/office/drawing/2016/5/11/chartex" xmlns:cx6="http://schemas.microsoft.com/office/drawing/2016/5/12/chartex" xmlns:cx7="http://schemas.microsoft.com/office/drawing/2016/5/13/chartex" xmlns:cx8="http://schemas.microsoft.com/office/drawing/2016/5/14/chartex" xmlns:mc="http://schemas.openxmlformats.org/markup-compatibility/2006" xmlns:aink="http://schemas.microsoft.com/office/drawing/2016/ink" xmlns:am3d="http://schemas.microsoft.com/office/drawing/2017/model3d" xmlns:o="urn:schemas-microsoft-com:office:office" xmlns:oel="http://schemas.microsoft.com/office/2019/extlst" xmlns:r="http://schemas.openxmlformats.org/officeDocument/2006/relationships" xmlns:m="http://schemas.openxmlformats.org/officeDocument/2006/math" xmlns:v="urn:schemas-microsoft-com:vml" xmlns:wp14="http://schemas.microsoft.com/office/word/2010/wordprocessingDrawing" xmlns:wp="http://schemas.openxmlformats.org/drawingml/2006/wordprocessingDrawing" xmlns:w10="urn:schemas-microsoft-com:office:word" xmlns:w="http://schemas.openxmlformats.org/wordprocessingml/2006/main" xmlns:w14="http://schemas.microsoft.com/office/word/2010/wordml" xmlns:w15="http://schemas.microsoft.com/office/word/2012/wordml" xmlns:w16cex="http://schemas.microsoft.com/office/word/2018/wordml/cex" xmlns:w16cid="http://schemas.microsoft.com/office/word/2016/wordml/cid" xmlns:w16="http://schemas.microsoft.com/office/word/2018/wordml" xmlns:w16du="http://schemas.microsoft.com/office/word/2023/wordml/word16du" xmlns:w16sdtdh="http://schemas.microsoft.com/office/word/2020/wordml/sdtdatahash" xmlns:w16sdtfl="http://schemas.microsoft.com/office/word/2024/wordml/sdtformatlock" xmlns:w16se="http://schemas.microsoft.com/office/word/2015/wordml/symex" xmlns:wpg="http://schemas.microsoft.com/office/word/2010/wordprocessingGroup" xmlns:wpi="http://schemas.microsoft.com/office/word/2010/wordprocessingInk" xmlns:wne="http://schemas.microsoft.com/office/word/2006/wordml" xmlns:wps="http://schemas.microsoft.com/office/word/2010/wordprocessingShape" mc:Ignorable="w14 w15 w16se w16cid w16 w16cex w16sdtdh w16sdtfl w16du wp14">
+  <w:footnote w:type="separator" w:id="-1">
+    <w:p>
+      <w:pPr>
+        <w:spacing w:line="240" w:lineRule="auto"/>
+      </w:pPr>
+      <w:r>
+        <w:separator/>
+      </w:r>
+    </w:p>
+  </w:footnote>
+  <w:footnote w:type="continuationSeparator" w:id="0">
+    <w:p>
+      <w:pPr>
+        <w:spacing w:line="240" w:lineRule="auto"/>
+      </w:pPr>
+      <w:r>
+        <w:continuationSeparator/>
+      </w:r>
+    </w:p>
+  </w:footnote>
+</w:footnotes>
+</file>
+
+<file path=word/header1.xml><?xml version="1.0" encoding="utf-8"?>
+<w:hdr xmlns:wpc="http://schemas.microsoft.com/office/word/2010/wordprocessingCanvas" xmlns:cx="http://schemas.microsoft.com/office/drawing/2014/chartex" xmlns:cx1="http://schemas.microsoft.com/office/drawing/2015/9/8/chartex" xmlns:cx2="http://schemas.microsoft.com/office/drawing/2015/10/21/chartex" xmlns:cx3="http://schemas.microsoft.com/office/drawing/2016/5/9/chartex" xmlns:cx4="http://schemas.microsoft.com/office/drawing/2016/5/10/chartex" xmlns:cx5="http://schemas.microsoft.com/office/drawing/2016/5/11/chartex" xmlns:cx6="http://schemas.microsoft.com/office/drawing/2016/5/12/chartex" xmlns:cx7="http://schemas.microsoft.com/office/drawing/2016/5/13/chartex" xmlns:cx8="http://schemas.microsoft.com/office/drawing/2016/5/14/chartex" xmlns:mc="http://schemas.openxmlformats.org/markup-compatibility/2006" xmlns:aink="http://schemas.microsoft.com/office/drawing/2016/ink" xmlns:am3d="http://schemas.microsoft.com/office/drawing/2017/model3d" xmlns:o="urn:schemas-microsoft-com:office:office" xmlns:oel="http://schemas.microsoft.com/office/2019/extlst" xmlns:r="http://schemas.openxmlformats.org/officeDocument/2006/relationships" xmlns:m="http://schemas.openxmlformats.org/officeDocument/2006/math" xmlns:v="urn:schemas-microsoft-com:vml" xmlns:wp14="http://schemas.microsoft.com/office/word/2010/wordprocessingDrawing" xmlns:wp="http://schemas.openxmlformats.org/drawingml/2006/wordprocessingDrawing" xmlns:w10="urn:schemas-microsoft-com:office:word" xmlns:w="http://schemas.openxmlformats.org/wordprocessingml/2006/main" xmlns:w14="http://schemas.microsoft.com/office/word/2010/wordml" xmlns:w15="http://schemas.microsoft.com/office/word/2012/wordml" xmlns:w16cex="http://schemas.microsoft.com/office/word/2018/wordml/cex" xmlns:w16cid="http://schemas.microsoft.com/office/word/2016/wordml/cid" xmlns:w16="http://schemas.microsoft.com/office/word/2018/wordml" xmlns:w16du="http://schemas.microsoft.com/office/word/2023/wordml/word16du" xmlns:w16sdtdh="http://schemas.microsoft.com/office/word/2020/wordml/sdtdatahash" xmlns:w16sdtfl="http://schemas.microsoft.com/office/word/2024/wordml/sdtformatlock" xmlns:w16se="http://schemas.microsoft.com/office/word/2015/wordml/symex" xmlns:wpg="http://schemas.microsoft.com/office/word/2010/wordprocessingGroup" xmlns:wpi="http://schemas.microsoft.com/office/word/2010/wordprocessingInk" xmlns:wne="http://schemas.microsoft.com/office/word/2006/wordml" xmlns:wps="http://schemas.microsoft.com/office/word/2010/wordprocessingShape" mc:Ignorable="w14 w15 w16se w16cid w16 w16cex w16sdtdh w16sdtfl w16du wp14">
+  <w:sdt>
+    <w:sdtPr>
+      <w:rPr>
+        <w:rStyle w:val="PageNumber"/>
+      </w:rPr>
+      <w:id w:val="299042204"/>
+      <w:docPartObj>
+        <w:docPartGallery w:val="Page Numbers (Top of Page)"/>
+        <w:docPartUnique/>
+      </w:docPartObj>
+    </w:sdtPr>
+    <w:sdtContent>
+      <w:p>
+        <w:pPr>
+          <w:pStyle w:val="Header"/>
+          <w:framePr w:wrap="none" w:vAnchor="text" w:hAnchor="margin" w:xAlign="right" w:y="1"/>
+          <w:rPr>
+            <w:rStyle w:val="PageNumber"/>
+          </w:rPr>
+        </w:pPr>
+        <w:r>
+          <w:rPr>
+            <w:rStyle w:val="PageNumber"/>
+          </w:rPr>
+          <w:fldChar w:fldCharType="begin"/>
+        </w:r>
+        <w:r>
+          <w:rPr>
+            <w:rStyle w:val="PageNumber"/>
+          </w:rPr>
+          <w:instrText xml:space="preserve"> PAGE </w:instrText>
+        </w:r>
+        <w:r>
+          <w:rPr>
+            <w:rStyle w:val="PageNumber"/>
+          </w:rPr>
+          <w:fldChar w:fldCharType="separate"/>
+        </w:r>
+        <w:r>
+          <w:rPr>
+            <w:rStyle w:val="PageNumber"/>
+          </w:rPr>
+          <w:fldChar w:fldCharType="end"/>
+        </w:r>
+      </w:p>
+    </w:sdtContent>
+  </w:sdt>
+  <w:p>
+    <w:pPr>
+      <w:pStyle w:val="Header"/>
+      <w:ind w:right="360"/>
+    </w:pPr>
+  </w:p>
+</w:hdr>
+</file>
+
+<file path=word/header2.xml><?xml version="1.0" encoding="utf-8"?>
+<w:hdr xmlns:wpc="http://schemas.microsoft.com/office/word/2010/wordprocessingCanvas" xmlns:cx="http://schemas.microsoft.com/office/drawing/2014/chartex" xmlns:cx1="http://schemas.microsoft.com/office/drawing/2015/9/8/chartex" xmlns:cx2="http://schemas.microsoft.com/office/drawing/2015/10/21/chartex" xmlns:cx3="http://schemas.microsoft.com/office/drawing/2016/5/9/chartex" xmlns:cx4="http://schemas.microsoft.com/office/drawing/2016/5/10/chartex" xmlns:cx5="http://schemas.microsoft.com/office/drawing/2016/5/11/chartex" xmlns:cx6="http://schemas.microsoft.com/office/drawing/2016/5/12/chartex" xmlns:cx7="http://schemas.microsoft.com/office/drawing/2016/5/13/chartex" xmlns:cx8="http://schemas.microsoft.com/office/drawing/2016/5/14/chartex" xmlns:mc="http://schemas.openxmlformats.org/markup-compatibility/2006" xmlns:aink="http://schemas.microsoft.com/office/drawing/2016/ink" xmlns:am3d="http://schemas.microsoft.com/office/drawing/2017/model3d" xmlns:o="urn:schemas-microsoft-com:office:office" xmlns:oel="http://schemas.microsoft.com/office/2019/extlst" xmlns:r="http://schemas.openxmlformats.org/officeDocument/2006/relationships" xmlns:m="http://schemas.openxmlformats.org/officeDocument/2006/math" xmlns:v="urn:schemas-microsoft-com:vml" xmlns:wp14="http://schemas.microsoft.com/office/word/2010/wordprocessingDrawing" xmlns:wp="http://schemas.openxmlformats.org/drawingml/2006/wordprocessingDrawing" xmlns:w10="urn:schemas-microsoft-com:office:word" xmlns:w="http://schemas.openxmlformats.org/wordprocessingml/2006/main" xmlns:w14="http://schemas.microsoft.com/office/word/2010/wordml" xmlns:w15="http://schemas.microsoft.com/office/word/2012/wordml" xmlns:w16cex="http://schemas.microsoft.com/office/word/2018/wordml/cex" xmlns:w16cid="http://schemas.microsoft.com/office/word/2016/wordml/cid" xmlns:w16="http://schemas.microsoft.com/office/word/2018/wordml" xmlns:w16du="http://schemas.microsoft.com/office/word/2023/wordml/word16du" xmlns:w16sdtdh="http://schemas.microsoft.com/office/word/2020/wordml/sdtdatahash" xmlns:w16sdtfl="http://schemas.microsoft.com/office/word/2024/wordml/sdtformatlock" xmlns:w16se="http://schemas.microsoft.com/office/word/2015/wordml/symex" xmlns:wpg="http://schemas.microsoft.com/office/word/2010/wordprocessingGroup" xmlns:wpi="http://schemas.microsoft.com/office/word/2010/wordprocessingInk" xmlns:wne="http://schemas.microsoft.com/office/word/2006/wordml" xmlns:wps="http://schemas.microsoft.com/office/word/2010/wordprocessingShape" mc:Ignorable="w14 w15 w16se w16cid w16 w16cex w16sdtdh w16sdtfl w16du wp14">
+  <w:sdt>
+    <w:sdtPr>
+      <w:rPr>
+        <w:rStyle w:val="PageNumber"/>
+      </w:rPr>
+      <w:id w:val="127054996"/>
+      <w:docPartObj>
+        <w:docPartGallery w:val="Page Numbers (Top of Page)"/>
+        <w:docPartUnique/>
+      </w:docPartObj>
+    </w:sdtPr>
+    <w:sdtContent>
+      <w:p>
+        <w:pPr>
+          <w:pStyle w:val="Header"/>
+          <w:framePr w:wrap="none" w:vAnchor="text" w:hAnchor="margin" w:xAlign="right" w:y="1"/>
+          <w:rPr>
+            <w:rStyle w:val="PageNumber"/>
+          </w:rPr>
+        </w:pPr>
+        <w:r>
+          <w:rPr>
+            <w:rStyle w:val="PageNumber"/>
+          </w:rPr>
+          <w:fldChar w:fldCharType="begin"/>
+        </w:r>
+        <w:r>
+          <w:rPr>
+            <w:rStyle w:val="PageNumber"/>
+          </w:rPr>
+          <w:instrText xml:space="preserve"> PAGE </w:instrText>
+        </w:r>
+        <w:r>
+          <w:rPr>
+            <w:rStyle w:val="PageNumber"/>
+          </w:rPr>
+          <w:fldChar w:fldCharType="separate"/>
+        </w:r>
+        <w:r>
+          <w:rPr>
+            <w:rStyle w:val="PageNumber"/>
+            <w:noProof/>
+          </w:rPr>
+          <w:t>1</w:t>
+        </w:r>
+        <w:r>
+          <w:rPr>
+            <w:rStyle w:val="PageNumber"/>
+          </w:rPr>
+          <w:fldChar w:fldCharType="end"/>
+        </w:r>
+      </w:p>
+    </w:sdtContent>
+  </w:sdt>
+  <w:p>
+    <w:pPr>
+      <w:pStyle w:val="Header"/>
+      <w:ind w:right="360"/>
+    </w:pPr>
+  </w:p>
+</w:hdr>
 </file>
 
 <file path=word/numbering.xml><?xml version="1.0" encoding="utf-8"?>
@@ -2624,6 +4005,58 @@
       <w:spacing w:val="5"/>
     </w:rPr>
   </w:style>
+  <w:style w:type="paragraph" w:styleId="Header">
+    <w:name w:val="header"/>
+    <w:basedOn w:val="Normal"/>
+    <w:link w:val="HeaderChar"/>
+    <w:uiPriority w:val="99"/>
+    <w:unhideWhenUsed/>
+    <w:rsid w:val="00BF1D52"/>
+    <w:pPr>
+      <w:tabs>
+        <w:tab w:val="center" w:pos="4680"/>
+        <w:tab w:val="right" w:pos="9360"/>
+      </w:tabs>
+      <w:spacing w:line="240" w:lineRule="auto"/>
+    </w:pPr>
+  </w:style>
+  <w:style w:type="character" w:customStyle="1" w:styleId="HeaderChar">
+    <w:name w:val="Header Char"/>
+    <w:basedOn w:val="DefaultParagraphFont"/>
+    <w:link w:val="Header"/>
+    <w:uiPriority w:val="99"/>
+    <w:rsid w:val="00BF1D52"/>
+  </w:style>
+  <w:style w:type="paragraph" w:styleId="Footer">
+    <w:name w:val="footer"/>
+    <w:basedOn w:val="Normal"/>
+    <w:link w:val="FooterChar"/>
+    <w:uiPriority w:val="99"/>
+    <w:unhideWhenUsed/>
+    <w:rsid w:val="00BF1D52"/>
+    <w:pPr>
+      <w:tabs>
+        <w:tab w:val="center" w:pos="4680"/>
+        <w:tab w:val="right" w:pos="9360"/>
+      </w:tabs>
+      <w:spacing w:line="240" w:lineRule="auto"/>
+    </w:pPr>
+  </w:style>
+  <w:style w:type="character" w:customStyle="1" w:styleId="FooterChar">
+    <w:name w:val="Footer Char"/>
+    <w:basedOn w:val="DefaultParagraphFont"/>
+    <w:link w:val="Footer"/>
+    <w:uiPriority w:val="99"/>
+    <w:rsid w:val="00BF1D52"/>
+  </w:style>
+  <w:style w:type="character" w:styleId="PageNumber">
+    <w:name w:val="page number"/>
+    <w:basedOn w:val="DefaultParagraphFont"/>
+    <w:uiPriority w:val="99"/>
+    <w:semiHidden/>
+    <w:unhideWhenUsed/>
+    <w:rsid w:val="00BF1D52"/>
+  </w:style>
 </w:styles>
 </file>
 

</xml_diff>